<commit_message>
Added ganntt project files
</commit_message>
<xml_diff>
--- a/Report/SavePlate Business PLan.docx
+++ b/Report/SavePlate Business PLan.docx
@@ -1,6 +1,6 @@
 
 <file path=word/document.xml><?xml version="1.0" encoding="utf-8"?>
-<w:document xmlns:wpc="http://schemas.microsoft.com/office/word/2010/wordprocessingCanvas" xmlns:cx="http://schemas.microsoft.com/office/drawing/2014/chartex" xmlns:cx1="http://schemas.microsoft.com/office/drawing/2015/9/8/chartex" xmlns:cx2="http://schemas.microsoft.com/office/drawing/2015/10/21/chartex" xmlns:cx3="http://schemas.microsoft.com/office/drawing/2016/5/9/chartex" xmlns:cx4="http://schemas.microsoft.com/office/drawing/2016/5/10/chartex" xmlns:cx5="http://schemas.microsoft.com/office/drawing/2016/5/11/chartex" xmlns:cx6="http://schemas.microsoft.com/office/drawing/2016/5/12/chartex" xmlns:cx7="http://schemas.microsoft.com/office/drawing/2016/5/13/chartex" xmlns:cx8="http://schemas.microsoft.com/office/drawing/2016/5/14/chartex" xmlns:mc="http://schemas.openxmlformats.org/markup-compatibility/2006" xmlns:aink="http://schemas.microsoft.com/office/drawing/2016/ink" xmlns:am3d="http://schemas.microsoft.com/office/drawing/2017/model3d" xmlns:o="urn:schemas-microsoft-com:office:office" xmlns:oel="http://schemas.microsoft.com/office/2019/extlst" xmlns:r="http://schemas.openxmlformats.org/officeDocument/2006/relationships" xmlns:m="http://schemas.openxmlformats.org/officeDocument/2006/math" xmlns:v="urn:schemas-microsoft-com:vml" xmlns:wp14="http://schemas.microsoft.com/office/word/2010/wordprocessingDrawing" xmlns:wp="http://schemas.openxmlformats.org/drawingml/2006/wordprocessingDrawing" xmlns:w10="urn:schemas-microsoft-com:office:word" xmlns:w="http://schemas.openxmlformats.org/wordprocessingml/2006/main" xmlns:w14="http://schemas.microsoft.com/office/word/2010/wordml" xmlns:w15="http://schemas.microsoft.com/office/word/2012/wordml" xmlns:w16cex="http://schemas.microsoft.com/office/word/2018/wordml/cex" xmlns:w16cid="http://schemas.microsoft.com/office/word/2016/wordml/cid" xmlns:w16="http://schemas.microsoft.com/office/word/2018/wordml" xmlns:w16du="http://schemas.microsoft.com/office/word/2023/wordml/word16du" xmlns:w16sdtdh="http://schemas.microsoft.com/office/word/2020/wordml/sdtdatahash" xmlns:w16sdtfl="http://schemas.microsoft.com/office/word/2024/wordml/sdtformatlock" xmlns:w16se="http://schemas.microsoft.com/office/word/2015/wordml/symex" xmlns:wpg="http://schemas.microsoft.com/office/word/2010/wordprocessingGroup" xmlns:wpi="http://schemas.microsoft.com/office/word/2010/wordprocessingInk" xmlns:wne="http://schemas.microsoft.com/office/word/2006/wordml" xmlns:wps="http://schemas.microsoft.com/office/word/2010/wordprocessingShape" mc:Ignorable="w14 w15 w16se w16cid w16 w16cex w16sdtdh w16sdtfl w16du wp14">
+<w:document xmlns:wpc="http://schemas.microsoft.com/office/word/2010/wordprocessingCanvas" xmlns:cx="http://schemas.microsoft.com/office/drawing/2014/chartex" xmlns:cx1="http://schemas.microsoft.com/office/drawing/2015/9/8/chartex" xmlns:cx2="http://schemas.microsoft.com/office/drawing/2015/10/21/chartex" xmlns:cx3="http://schemas.microsoft.com/office/drawing/2016/5/9/chartex" xmlns:cx4="http://schemas.microsoft.com/office/drawing/2016/5/10/chartex" xmlns:cx5="http://schemas.microsoft.com/office/drawing/2016/5/11/chartex" xmlns:cx6="http://schemas.microsoft.com/office/drawing/2016/5/12/chartex" xmlns:cx7="http://schemas.microsoft.com/office/drawing/2016/5/13/chartex" xmlns:cx8="http://schemas.microsoft.com/office/drawing/2016/5/14/chartex" xmlns:mc="http://schemas.openxmlformats.org/markup-compatibility/2006" xmlns:aink="http://schemas.microsoft.com/office/drawing/2016/ink" xmlns:am3d="http://schemas.microsoft.com/office/drawing/2017/model3d" xmlns:o="urn:schemas-microsoft-com:office:office" xmlns:oel="http://schemas.microsoft.com/office/2019/extlst" xmlns:r="http://schemas.openxmlformats.org/officeDocument/2006/relationships" xmlns:m="http://schemas.openxmlformats.org/officeDocument/2006/math" xmlns:v="urn:schemas-microsoft-com:vml" xmlns:wp14="http://schemas.microsoft.com/office/word/2010/wordprocessingDrawing" xmlns:wp="http://schemas.openxmlformats.org/drawingml/2006/wordprocessingDrawing" xmlns:w10="urn:schemas-microsoft-com:office:word" xmlns:w="http://schemas.openxmlformats.org/wordprocessingml/2006/main" xmlns:w14="http://schemas.microsoft.com/office/word/2010/wordml" xmlns:w15="http://schemas.microsoft.com/office/word/2012/wordml" xmlns:w16cex="http://schemas.microsoft.com/office/word/2018/wordml/cex" xmlns:w16cid="http://schemas.microsoft.com/office/word/2016/wordml/cid" xmlns:w16="http://schemas.microsoft.com/office/word/2018/wordml" xmlns:w16sdtdh="http://schemas.microsoft.com/office/word/2020/wordml/sdtdatahash" xmlns:w16se="http://schemas.microsoft.com/office/word/2015/wordml/symex" xmlns:wpg="http://schemas.microsoft.com/office/word/2010/wordprocessingGroup" xmlns:wpi="http://schemas.microsoft.com/office/word/2010/wordprocessingInk" xmlns:wne="http://schemas.microsoft.com/office/word/2006/wordml" xmlns:wps="http://schemas.microsoft.com/office/word/2010/wordprocessingShape" mc:Ignorable="w14 w15 w16se w16cid w16 w16cex w16sdtdh wp14">
   <w:body>
     <w:p>
       <w:pPr>
@@ -1628,7 +1628,7 @@
                 <w:sz w:val="24"/>
                 <w:szCs w:val="24"/>
               </w:rPr>
-              <w:t>Node.js</w:t>
+              <w:t>Spring Boot</w:t>
             </w:r>
           </w:p>
         </w:tc>
@@ -1728,16 +1728,14 @@
                 <w:szCs w:val="24"/>
               </w:rPr>
             </w:pPr>
-            <w:proofErr w:type="spellStart"/>
-            <w:r>
-              <w:rPr>
-                <w:rFonts w:ascii="Times New Roman" w:hAnsi="Times New Roman" w:cs="Times New Roman"/>
-                <w:sz w:val="24"/>
-                <w:szCs w:val="24"/>
-              </w:rPr>
-              <w:t>Mongodb</w:t>
-            </w:r>
-            <w:proofErr w:type="spellEnd"/>
+            <w:r>
+              <w:rPr>
+                <w:rFonts w:ascii="Times New Roman" w:hAnsi="Times New Roman" w:cs="Times New Roman"/>
+                <w:sz w:val="24"/>
+                <w:szCs w:val="24"/>
+              </w:rPr>
+              <w:t>SQL</w:t>
+            </w:r>
           </w:p>
         </w:tc>
         <w:tc>
@@ -2720,7 +2718,7 @@
 </file>
 
 <file path=word/numbering.xml><?xml version="1.0" encoding="utf-8"?>
-<w:numbering xmlns:wpc="http://schemas.microsoft.com/office/word/2010/wordprocessingCanvas" xmlns:cx="http://schemas.microsoft.com/office/drawing/2014/chartex" xmlns:cx1="http://schemas.microsoft.com/office/drawing/2015/9/8/chartex" xmlns:cx2="http://schemas.microsoft.com/office/drawing/2015/10/21/chartex" xmlns:cx3="http://schemas.microsoft.com/office/drawing/2016/5/9/chartex" xmlns:cx4="http://schemas.microsoft.com/office/drawing/2016/5/10/chartex" xmlns:cx5="http://schemas.microsoft.com/office/drawing/2016/5/11/chartex" xmlns:cx6="http://schemas.microsoft.com/office/drawing/2016/5/12/chartex" xmlns:cx7="http://schemas.microsoft.com/office/drawing/2016/5/13/chartex" xmlns:cx8="http://schemas.microsoft.com/office/drawing/2016/5/14/chartex" xmlns:mc="http://schemas.openxmlformats.org/markup-compatibility/2006" xmlns:aink="http://schemas.microsoft.com/office/drawing/2016/ink" xmlns:am3d="http://schemas.microsoft.com/office/drawing/2017/model3d" xmlns:o="urn:schemas-microsoft-com:office:office" xmlns:oel="http://schemas.microsoft.com/office/2019/extlst" xmlns:r="http://schemas.openxmlformats.org/officeDocument/2006/relationships" xmlns:m="http://schemas.openxmlformats.org/officeDocument/2006/math" xmlns:v="urn:schemas-microsoft-com:vml" xmlns:wp14="http://schemas.microsoft.com/office/word/2010/wordprocessingDrawing" xmlns:wp="http://schemas.openxmlformats.org/drawingml/2006/wordprocessingDrawing" xmlns:w10="urn:schemas-microsoft-com:office:word" xmlns:w="http://schemas.openxmlformats.org/wordprocessingml/2006/main" xmlns:w14="http://schemas.microsoft.com/office/word/2010/wordml" xmlns:w15="http://schemas.microsoft.com/office/word/2012/wordml" xmlns:w16cex="http://schemas.microsoft.com/office/word/2018/wordml/cex" xmlns:w16cid="http://schemas.microsoft.com/office/word/2016/wordml/cid" xmlns:w16="http://schemas.microsoft.com/office/word/2018/wordml" xmlns:w16du="http://schemas.microsoft.com/office/word/2023/wordml/word16du" xmlns:w16sdtdh="http://schemas.microsoft.com/office/word/2020/wordml/sdtdatahash" xmlns:w16sdtfl="http://schemas.microsoft.com/office/word/2024/wordml/sdtformatlock" xmlns:w16se="http://schemas.microsoft.com/office/word/2015/wordml/symex" xmlns:wpg="http://schemas.microsoft.com/office/word/2010/wordprocessingGroup" xmlns:wpi="http://schemas.microsoft.com/office/word/2010/wordprocessingInk" xmlns:wne="http://schemas.microsoft.com/office/word/2006/wordml" xmlns:wps="http://schemas.microsoft.com/office/word/2010/wordprocessingShape" mc:Ignorable="w14 w15 w16se w16cid w16 w16cex w16sdtdh w16sdtfl w16du wp14">
+<w:numbering xmlns:wpc="http://schemas.microsoft.com/office/word/2010/wordprocessingCanvas" xmlns:cx="http://schemas.microsoft.com/office/drawing/2014/chartex" xmlns:cx1="http://schemas.microsoft.com/office/drawing/2015/9/8/chartex" xmlns:cx2="http://schemas.microsoft.com/office/drawing/2015/10/21/chartex" xmlns:cx3="http://schemas.microsoft.com/office/drawing/2016/5/9/chartex" xmlns:cx4="http://schemas.microsoft.com/office/drawing/2016/5/10/chartex" xmlns:cx5="http://schemas.microsoft.com/office/drawing/2016/5/11/chartex" xmlns:cx6="http://schemas.microsoft.com/office/drawing/2016/5/12/chartex" xmlns:cx7="http://schemas.microsoft.com/office/drawing/2016/5/13/chartex" xmlns:cx8="http://schemas.microsoft.com/office/drawing/2016/5/14/chartex" xmlns:mc="http://schemas.openxmlformats.org/markup-compatibility/2006" xmlns:aink="http://schemas.microsoft.com/office/drawing/2016/ink" xmlns:am3d="http://schemas.microsoft.com/office/drawing/2017/model3d" xmlns:o="urn:schemas-microsoft-com:office:office" xmlns:oel="http://schemas.microsoft.com/office/2019/extlst" xmlns:r="http://schemas.openxmlformats.org/officeDocument/2006/relationships" xmlns:m="http://schemas.openxmlformats.org/officeDocument/2006/math" xmlns:v="urn:schemas-microsoft-com:vml" xmlns:wp14="http://schemas.microsoft.com/office/word/2010/wordprocessingDrawing" xmlns:wp="http://schemas.openxmlformats.org/drawingml/2006/wordprocessingDrawing" xmlns:w10="urn:schemas-microsoft-com:office:word" xmlns:w="http://schemas.openxmlformats.org/wordprocessingml/2006/main" xmlns:w14="http://schemas.microsoft.com/office/word/2010/wordml" xmlns:w15="http://schemas.microsoft.com/office/word/2012/wordml" xmlns:w16cex="http://schemas.microsoft.com/office/word/2018/wordml/cex" xmlns:w16cid="http://schemas.microsoft.com/office/word/2016/wordml/cid" xmlns:w16="http://schemas.microsoft.com/office/word/2018/wordml" xmlns:w16sdtdh="http://schemas.microsoft.com/office/word/2020/wordml/sdtdatahash" xmlns:w16se="http://schemas.microsoft.com/office/word/2015/wordml/symex" xmlns:wpg="http://schemas.microsoft.com/office/word/2010/wordprocessingGroup" xmlns:wpi="http://schemas.microsoft.com/office/word/2010/wordprocessingInk" xmlns:wne="http://schemas.microsoft.com/office/word/2006/wordml" xmlns:wps="http://schemas.microsoft.com/office/word/2010/wordprocessingShape" mc:Ignorable="w14 w15 w16se w16cid w16 w16cex w16sdtdh wp14">
   <w:abstractNum w:abstractNumId="0" w15:restartNumberingAfterBreak="0">
     <w:nsid w:val="4BC335D7"/>
     <w:multiLevelType w:val="multilevel"/>
@@ -3285,7 +3283,7 @@
 </file>
 
 <file path=word/styles.xml><?xml version="1.0" encoding="utf-8"?>
-<w:styles xmlns:mc="http://schemas.openxmlformats.org/markup-compatibility/2006" xmlns:r="http://schemas.openxmlformats.org/officeDocument/2006/relationships" xmlns:w="http://schemas.openxmlformats.org/wordprocessingml/2006/main" xmlns:w14="http://schemas.microsoft.com/office/word/2010/wordml" xmlns:w15="http://schemas.microsoft.com/office/word/2012/wordml" xmlns:w16cex="http://schemas.microsoft.com/office/word/2018/wordml/cex" xmlns:w16cid="http://schemas.microsoft.com/office/word/2016/wordml/cid" xmlns:w16="http://schemas.microsoft.com/office/word/2018/wordml" xmlns:w16du="http://schemas.microsoft.com/office/word/2023/wordml/word16du" xmlns:w16sdtdh="http://schemas.microsoft.com/office/word/2020/wordml/sdtdatahash" xmlns:w16sdtfl="http://schemas.microsoft.com/office/word/2024/wordml/sdtformatlock" xmlns:w16se="http://schemas.microsoft.com/office/word/2015/wordml/symex" mc:Ignorable="w14 w15 w16se w16cid w16 w16cex w16sdtdh w16sdtfl w16du">
+<w:styles xmlns:mc="http://schemas.openxmlformats.org/markup-compatibility/2006" xmlns:r="http://schemas.openxmlformats.org/officeDocument/2006/relationships" xmlns:w="http://schemas.openxmlformats.org/wordprocessingml/2006/main" xmlns:w14="http://schemas.microsoft.com/office/word/2010/wordml" xmlns:w15="http://schemas.microsoft.com/office/word/2012/wordml" xmlns:w16cex="http://schemas.microsoft.com/office/word/2018/wordml/cex" xmlns:w16cid="http://schemas.microsoft.com/office/word/2016/wordml/cid" xmlns:w16="http://schemas.microsoft.com/office/word/2018/wordml" xmlns:w16sdtdh="http://schemas.microsoft.com/office/word/2020/wordml/sdtdatahash" xmlns:w16se="http://schemas.microsoft.com/office/word/2015/wordml/symex" mc:Ignorable="w14 w15 w16se w16cid w16 w16cex w16sdtdh">
   <w:docDefaults>
     <w:rPrDefault>
       <w:rPr>

</xml_diff>

<commit_message>
breaking point of the branch
</commit_message>
<xml_diff>
--- a/Report/SavePlate Business PLan.docx
+++ b/Report/SavePlate Business PLan.docx
@@ -1,10 +1,10 @@
 
 <file path=word/document.xml><?xml version="1.0" encoding="utf-8"?>
-<w:document xmlns:wpc="http://schemas.microsoft.com/office/word/2010/wordprocessingCanvas" xmlns:cx="http://schemas.microsoft.com/office/drawing/2014/chartex" xmlns:cx1="http://schemas.microsoft.com/office/drawing/2015/9/8/chartex" xmlns:cx2="http://schemas.microsoft.com/office/drawing/2015/10/21/chartex" xmlns:cx3="http://schemas.microsoft.com/office/drawing/2016/5/9/chartex" xmlns:cx4="http://schemas.microsoft.com/office/drawing/2016/5/10/chartex" xmlns:cx5="http://schemas.microsoft.com/office/drawing/2016/5/11/chartex" xmlns:cx6="http://schemas.microsoft.com/office/drawing/2016/5/12/chartex" xmlns:cx7="http://schemas.microsoft.com/office/drawing/2016/5/13/chartex" xmlns:cx8="http://schemas.microsoft.com/office/drawing/2016/5/14/chartex" xmlns:mc="http://schemas.openxmlformats.org/markup-compatibility/2006" xmlns:aink="http://schemas.microsoft.com/office/drawing/2016/ink" xmlns:am3d="http://schemas.microsoft.com/office/drawing/2017/model3d" xmlns:o="urn:schemas-microsoft-com:office:office" xmlns:oel="http://schemas.microsoft.com/office/2019/extlst" xmlns:r="http://schemas.openxmlformats.org/officeDocument/2006/relationships" xmlns:m="http://schemas.openxmlformats.org/officeDocument/2006/math" xmlns:v="urn:schemas-microsoft-com:vml" xmlns:wp14="http://schemas.microsoft.com/office/word/2010/wordprocessingDrawing" xmlns:wp="http://schemas.openxmlformats.org/drawingml/2006/wordprocessingDrawing" xmlns:w10="urn:schemas-microsoft-com:office:word" xmlns:w="http://schemas.openxmlformats.org/wordprocessingml/2006/main" xmlns:w14="http://schemas.microsoft.com/office/word/2010/wordml" xmlns:w15="http://schemas.microsoft.com/office/word/2012/wordml" xmlns:w16cex="http://schemas.microsoft.com/office/word/2018/wordml/cex" xmlns:w16cid="http://schemas.microsoft.com/office/word/2016/wordml/cid" xmlns:w16="http://schemas.microsoft.com/office/word/2018/wordml" xmlns:w16sdtdh="http://schemas.microsoft.com/office/word/2020/wordml/sdtdatahash" xmlns:w16se="http://schemas.microsoft.com/office/word/2015/wordml/symex" xmlns:wpg="http://schemas.microsoft.com/office/word/2010/wordprocessingGroup" xmlns:wpi="http://schemas.microsoft.com/office/word/2010/wordprocessingInk" xmlns:wne="http://schemas.microsoft.com/office/word/2006/wordml" xmlns:wps="http://schemas.microsoft.com/office/word/2010/wordprocessingShape" mc:Ignorable="w14 w15 w16se w16cid w16 w16cex w16sdtdh wp14">
+<w:document xmlns:wpc="http://schemas.microsoft.com/office/word/2010/wordprocessingCanvas" xmlns:cx="http://schemas.microsoft.com/office/drawing/2014/chartex" xmlns:cx1="http://schemas.microsoft.com/office/drawing/2015/9/8/chartex" xmlns:cx2="http://schemas.microsoft.com/office/drawing/2015/10/21/chartex" xmlns:cx3="http://schemas.microsoft.com/office/drawing/2016/5/9/chartex" xmlns:cx4="http://schemas.microsoft.com/office/drawing/2016/5/10/chartex" xmlns:cx5="http://schemas.microsoft.com/office/drawing/2016/5/11/chartex" xmlns:cx6="http://schemas.microsoft.com/office/drawing/2016/5/12/chartex" xmlns:cx7="http://schemas.microsoft.com/office/drawing/2016/5/13/chartex" xmlns:cx8="http://schemas.microsoft.com/office/drawing/2016/5/14/chartex" xmlns:mc="http://schemas.openxmlformats.org/markup-compatibility/2006" xmlns:aink="http://schemas.microsoft.com/office/drawing/2016/ink" xmlns:am3d="http://schemas.microsoft.com/office/drawing/2017/model3d" xmlns:o="urn:schemas-microsoft-com:office:office" xmlns:oel="http://schemas.microsoft.com/office/2019/extlst" xmlns:r="http://schemas.openxmlformats.org/officeDocument/2006/relationships" xmlns:m="http://schemas.openxmlformats.org/officeDocument/2006/math" xmlns:v="urn:schemas-microsoft-com:vml" xmlns:wp14="http://schemas.microsoft.com/office/word/2010/wordprocessingDrawing" xmlns:wp="http://schemas.openxmlformats.org/drawingml/2006/wordprocessingDrawing" xmlns:w10="urn:schemas-microsoft-com:office:word" xmlns:w="http://schemas.openxmlformats.org/wordprocessingml/2006/main" xmlns:w14="http://schemas.microsoft.com/office/word/2010/wordml" xmlns:w15="http://schemas.microsoft.com/office/word/2012/wordml" xmlns:w16cex="http://schemas.microsoft.com/office/word/2018/wordml/cex" xmlns:w16cid="http://schemas.microsoft.com/office/word/2016/wordml/cid" xmlns:w16="http://schemas.microsoft.com/office/word/2018/wordml" xmlns:w16du="http://schemas.microsoft.com/office/word/2023/wordml/word16du" xmlns:w16sdtdh="http://schemas.microsoft.com/office/word/2020/wordml/sdtdatahash" xmlns:w16se="http://schemas.microsoft.com/office/word/2015/wordml/symex" xmlns:wpg="http://schemas.microsoft.com/office/word/2010/wordprocessingGroup" xmlns:wpi="http://schemas.microsoft.com/office/word/2010/wordprocessingInk" xmlns:wne="http://schemas.microsoft.com/office/word/2006/wordml" xmlns:wps="http://schemas.microsoft.com/office/word/2010/wordprocessingShape" mc:Ignorable="w14 w15 w16se w16cid w16 w16cex w16sdtdh wp14">
   <w:body>
     <w:p>
       <w:pPr>
-        <w:spacing w:line="360" w:lineRule="auto"/>
+        <w:spacing w:before="240" w:line="360" w:lineRule="auto"/>
         <w:ind w:left="720" w:hanging="360"/>
         <w:jc w:val="center"/>
         <w:rPr>
@@ -18,7 +18,7 @@
     </w:p>
     <w:p>
       <w:pPr>
-        <w:spacing w:line="360" w:lineRule="auto"/>
+        <w:spacing w:before="240" w:line="360" w:lineRule="auto"/>
         <w:ind w:left="720" w:hanging="360"/>
         <w:jc w:val="center"/>
         <w:rPr>
@@ -32,7 +32,7 @@
     </w:p>
     <w:p>
       <w:pPr>
-        <w:spacing w:line="360" w:lineRule="auto"/>
+        <w:spacing w:before="240" w:line="360" w:lineRule="auto"/>
         <w:ind w:left="720" w:hanging="360"/>
         <w:jc w:val="center"/>
         <w:rPr>
@@ -46,7 +46,7 @@
     </w:p>
     <w:p>
       <w:pPr>
-        <w:spacing w:line="360" w:lineRule="auto"/>
+        <w:spacing w:before="240" w:line="360" w:lineRule="auto"/>
         <w:ind w:left="720" w:hanging="360"/>
         <w:jc w:val="center"/>
         <w:rPr>
@@ -60,7 +60,7 @@
     </w:p>
     <w:p>
       <w:pPr>
-        <w:spacing w:line="360" w:lineRule="auto"/>
+        <w:spacing w:before="240" w:line="360" w:lineRule="auto"/>
         <w:ind w:left="720" w:hanging="360"/>
         <w:jc w:val="center"/>
         <w:rPr>
@@ -91,7 +91,6 @@
         </w:rPr>
         <w:br/>
       </w:r>
-      <w:proofErr w:type="spellStart"/>
       <w:r>
         <w:rPr>
           <w:rFonts w:ascii="Times New Roman" w:hAnsi="Times New Roman" w:cs="Times New Roman"/>
@@ -100,10 +99,12 @@
           <w:sz w:val="32"/>
           <w:szCs w:val="32"/>
         </w:rPr>
-        <w:t>SavePlate</w:t>
-      </w:r>
-      <w:proofErr w:type="spellEnd"/>
-      <w:r>
+        <w:t>SavePlate: Smart Food Waste Reduction System</w:t>
+      </w:r>
+    </w:p>
+    <w:p>
+      <w:pPr>
+        <w:spacing w:before="240" w:line="360" w:lineRule="auto"/>
         <w:rPr>
           <w:rFonts w:ascii="Times New Roman" w:hAnsi="Times New Roman" w:cs="Times New Roman"/>
           <w:b/>
@@ -111,11 +112,8 @@
           <w:sz w:val="32"/>
           <w:szCs w:val="32"/>
         </w:rPr>
-        <w:t>: Smart Food Waste Reduction System</w:t>
-      </w:r>
-    </w:p>
-    <w:p>
-      <w:pPr>
+      </w:pPr>
+      <w:r>
         <w:rPr>
           <w:rFonts w:ascii="Times New Roman" w:hAnsi="Times New Roman" w:cs="Times New Roman"/>
           <w:b/>
@@ -123,293 +121,524 @@
           <w:sz w:val="32"/>
           <w:szCs w:val="32"/>
         </w:rPr>
-      </w:pPr>
-      <w:r>
-        <w:rPr>
-          <w:rFonts w:ascii="Times New Roman" w:hAnsi="Times New Roman" w:cs="Times New Roman"/>
-          <w:b/>
-          <w:bCs/>
-          <w:sz w:val="32"/>
-          <w:szCs w:val="32"/>
-        </w:rPr>
         <w:br w:type="page"/>
       </w:r>
     </w:p>
     <w:p>
       <w:pPr>
-        <w:pStyle w:val="ListParagraph"/>
-        <w:spacing w:line="360" w:lineRule="auto"/>
-        <w:rPr>
-          <w:rFonts w:ascii="Times New Roman" w:hAnsi="Times New Roman" w:cs="Times New Roman"/>
-          <w:b/>
-          <w:bCs/>
-          <w:sz w:val="24"/>
-          <w:szCs w:val="24"/>
-        </w:rPr>
-      </w:pPr>
-      <w:r>
-        <w:rPr>
-          <w:rFonts w:ascii="Times New Roman" w:hAnsi="Times New Roman" w:cs="Times New Roman"/>
-          <w:b/>
-          <w:bCs/>
-          <w:sz w:val="24"/>
-          <w:szCs w:val="24"/>
-        </w:rPr>
+        <w:pStyle w:val="Main-Heading"/>
+        <w:spacing w:before="240"/>
+      </w:pPr>
+      <w:r>
         <w:lastRenderedPageBreak/>
-        <w:t>Table of Contents</w:t>
-      </w:r>
-    </w:p>
-    <w:p>
-      <w:pPr>
-        <w:pStyle w:val="ListParagraph"/>
-        <w:numPr>
-          <w:ilvl w:val="0"/>
-          <w:numId w:val="6"/>
-        </w:numPr>
-        <w:spacing w:line="360" w:lineRule="auto"/>
-        <w:rPr>
-          <w:rFonts w:ascii="Times New Roman" w:hAnsi="Times New Roman" w:cs="Times New Roman"/>
-          <w:sz w:val="24"/>
-          <w:szCs w:val="24"/>
-        </w:rPr>
-      </w:pPr>
-      <w:r>
-        <w:rPr>
-          <w:rFonts w:ascii="Times New Roman" w:hAnsi="Times New Roman" w:cs="Times New Roman"/>
-          <w:sz w:val="24"/>
-          <w:szCs w:val="24"/>
-        </w:rPr>
         <w:t>Overview</w:t>
       </w:r>
     </w:p>
     <w:p>
       <w:pPr>
-        <w:pStyle w:val="ListParagraph"/>
-        <w:numPr>
-          <w:ilvl w:val="0"/>
-          <w:numId w:val="6"/>
-        </w:numPr>
-        <w:spacing w:line="360" w:lineRule="auto"/>
-        <w:rPr>
-          <w:rFonts w:ascii="Times New Roman" w:hAnsi="Times New Roman" w:cs="Times New Roman"/>
-          <w:sz w:val="24"/>
-          <w:szCs w:val="24"/>
-        </w:rPr>
-      </w:pPr>
-      <w:r>
-        <w:rPr>
-          <w:rFonts w:ascii="Times New Roman" w:hAnsi="Times New Roman" w:cs="Times New Roman"/>
-          <w:sz w:val="24"/>
-          <w:szCs w:val="24"/>
-        </w:rPr>
-        <w:t>Project Aims</w:t>
-      </w:r>
-    </w:p>
-    <w:p>
-      <w:pPr>
-        <w:pStyle w:val="ListParagraph"/>
-        <w:numPr>
-          <w:ilvl w:val="0"/>
-          <w:numId w:val="6"/>
-        </w:numPr>
-        <w:spacing w:line="360" w:lineRule="auto"/>
-        <w:rPr>
-          <w:rFonts w:ascii="Times New Roman" w:hAnsi="Times New Roman" w:cs="Times New Roman"/>
-          <w:sz w:val="24"/>
-          <w:szCs w:val="24"/>
-        </w:rPr>
-      </w:pPr>
-      <w:r>
-        <w:rPr>
-          <w:rFonts w:ascii="Times New Roman" w:hAnsi="Times New Roman" w:cs="Times New Roman"/>
-          <w:sz w:val="24"/>
-          <w:szCs w:val="24"/>
-        </w:rPr>
-        <w:t>Project Objectives</w:t>
-      </w:r>
-    </w:p>
-    <w:p>
-      <w:pPr>
-        <w:pStyle w:val="ListParagraph"/>
-        <w:numPr>
-          <w:ilvl w:val="0"/>
-          <w:numId w:val="6"/>
-        </w:numPr>
-        <w:spacing w:line="360" w:lineRule="auto"/>
-        <w:rPr>
-          <w:rFonts w:ascii="Times New Roman" w:hAnsi="Times New Roman" w:cs="Times New Roman"/>
-          <w:sz w:val="24"/>
-          <w:szCs w:val="24"/>
-        </w:rPr>
-      </w:pPr>
-      <w:r>
-        <w:rPr>
-          <w:rFonts w:ascii="Times New Roman" w:hAnsi="Times New Roman" w:cs="Times New Roman"/>
-          <w:sz w:val="24"/>
-          <w:szCs w:val="24"/>
-        </w:rPr>
-        <w:t>Project Scope</w:t>
-      </w:r>
-    </w:p>
-    <w:p>
-      <w:pPr>
-        <w:pStyle w:val="ListParagraph"/>
-        <w:numPr>
-          <w:ilvl w:val="1"/>
-          <w:numId w:val="6"/>
-        </w:numPr>
-        <w:spacing w:line="360" w:lineRule="auto"/>
-        <w:rPr>
-          <w:rFonts w:ascii="Times New Roman" w:hAnsi="Times New Roman" w:cs="Times New Roman"/>
-          <w:sz w:val="24"/>
-          <w:szCs w:val="24"/>
-        </w:rPr>
-      </w:pPr>
-      <w:r>
-        <w:rPr>
-          <w:rFonts w:ascii="Times New Roman" w:hAnsi="Times New Roman" w:cs="Times New Roman"/>
-          <w:sz w:val="24"/>
-          <w:szCs w:val="24"/>
-        </w:rPr>
-        <w:t>In scope</w:t>
-      </w:r>
-    </w:p>
-    <w:p>
-      <w:pPr>
-        <w:pStyle w:val="ListParagraph"/>
-        <w:numPr>
-          <w:ilvl w:val="1"/>
-          <w:numId w:val="6"/>
-        </w:numPr>
-        <w:spacing w:line="360" w:lineRule="auto"/>
-        <w:rPr>
-          <w:rFonts w:ascii="Times New Roman" w:hAnsi="Times New Roman" w:cs="Times New Roman"/>
-          <w:sz w:val="24"/>
-          <w:szCs w:val="24"/>
-        </w:rPr>
-      </w:pPr>
-      <w:r>
-        <w:rPr>
-          <w:rFonts w:ascii="Times New Roman" w:hAnsi="Times New Roman" w:cs="Times New Roman"/>
-          <w:sz w:val="24"/>
-          <w:szCs w:val="24"/>
-        </w:rPr>
-        <w:t>Out of scope</w:t>
-      </w:r>
-    </w:p>
-    <w:p>
-      <w:pPr>
-        <w:pStyle w:val="ListParagraph"/>
-        <w:numPr>
-          <w:ilvl w:val="0"/>
-          <w:numId w:val="6"/>
-        </w:numPr>
-        <w:spacing w:line="360" w:lineRule="auto"/>
-        <w:rPr>
-          <w:rFonts w:ascii="Times New Roman" w:hAnsi="Times New Roman" w:cs="Times New Roman"/>
-          <w:sz w:val="24"/>
-          <w:szCs w:val="24"/>
-        </w:rPr>
-      </w:pPr>
-      <w:r>
-        <w:rPr>
-          <w:rFonts w:ascii="Times New Roman" w:hAnsi="Times New Roman" w:cs="Times New Roman"/>
-          <w:sz w:val="24"/>
-          <w:szCs w:val="24"/>
-        </w:rPr>
-        <w:t>Project Schedule</w:t>
-      </w:r>
-    </w:p>
-    <w:p>
-      <w:pPr>
-        <w:pStyle w:val="ListParagraph"/>
-        <w:numPr>
-          <w:ilvl w:val="0"/>
-          <w:numId w:val="6"/>
-        </w:numPr>
-        <w:spacing w:line="360" w:lineRule="auto"/>
-        <w:rPr>
-          <w:rFonts w:ascii="Times New Roman" w:hAnsi="Times New Roman" w:cs="Times New Roman"/>
-          <w:sz w:val="24"/>
-          <w:szCs w:val="24"/>
-        </w:rPr>
-      </w:pPr>
-      <w:r>
-        <w:rPr>
-          <w:rFonts w:ascii="Times New Roman" w:hAnsi="Times New Roman" w:cs="Times New Roman"/>
-          <w:sz w:val="24"/>
-          <w:szCs w:val="24"/>
-        </w:rPr>
-        <w:t>Technical Description</w:t>
-      </w:r>
-    </w:p>
-    <w:p>
-      <w:pPr>
-        <w:pStyle w:val="ListParagraph"/>
-        <w:numPr>
-          <w:ilvl w:val="1"/>
-          <w:numId w:val="6"/>
-        </w:numPr>
-        <w:spacing w:line="360" w:lineRule="auto"/>
-        <w:rPr>
-          <w:rFonts w:ascii="Times New Roman" w:hAnsi="Times New Roman" w:cs="Times New Roman"/>
-          <w:sz w:val="24"/>
-          <w:szCs w:val="24"/>
-        </w:rPr>
-      </w:pPr>
-      <w:r>
-        <w:rPr>
-          <w:rFonts w:ascii="Times New Roman" w:hAnsi="Times New Roman" w:cs="Times New Roman"/>
-          <w:sz w:val="24"/>
-          <w:szCs w:val="24"/>
-        </w:rPr>
-        <w:t>Development Platform</w:t>
-      </w:r>
-    </w:p>
-    <w:p>
-      <w:pPr>
-        <w:pStyle w:val="ListParagraph"/>
-        <w:numPr>
-          <w:ilvl w:val="1"/>
-          <w:numId w:val="6"/>
-        </w:numPr>
-        <w:spacing w:line="360" w:lineRule="auto"/>
-        <w:rPr>
-          <w:rFonts w:ascii="Times New Roman" w:hAnsi="Times New Roman" w:cs="Times New Roman"/>
-          <w:sz w:val="24"/>
-          <w:szCs w:val="24"/>
-        </w:rPr>
-      </w:pPr>
-      <w:r>
-        <w:rPr>
-          <w:rFonts w:ascii="Times New Roman" w:hAnsi="Times New Roman" w:cs="Times New Roman"/>
-          <w:sz w:val="24"/>
-          <w:szCs w:val="24"/>
-        </w:rPr>
-        <w:t>Demonstration Platform</w:t>
-      </w:r>
-    </w:p>
-    <w:p>
-      <w:pPr>
-        <w:pStyle w:val="ListParagraph"/>
-        <w:numPr>
-          <w:ilvl w:val="0"/>
-          <w:numId w:val="6"/>
-        </w:numPr>
-        <w:spacing w:line="360" w:lineRule="auto"/>
-        <w:rPr>
-          <w:rFonts w:ascii="Times New Roman" w:hAnsi="Times New Roman" w:cs="Times New Roman"/>
-          <w:sz w:val="24"/>
-          <w:szCs w:val="24"/>
-        </w:rPr>
-      </w:pPr>
-      <w:r>
-        <w:rPr>
-          <w:rFonts w:ascii="Times New Roman" w:hAnsi="Times New Roman" w:cs="Times New Roman"/>
-          <w:sz w:val="24"/>
-          <w:szCs w:val="24"/>
-        </w:rPr>
-        <w:t>Risk Management Plan</w:t>
+        <w:spacing w:before="240" w:line="360" w:lineRule="auto"/>
+        <w:jc w:val="both"/>
+        <w:rPr>
+          <w:rFonts w:ascii="Times New Roman" w:hAnsi="Times New Roman" w:cs="Times New Roman"/>
+          <w:sz w:val="24"/>
+          <w:szCs w:val="24"/>
+          <w:shd w:val="clear" w:color="auto" w:fill="FFFFFF"/>
+        </w:rPr>
+      </w:pPr>
+      <w:r>
+        <w:rPr>
+          <w:rFonts w:ascii="Times New Roman" w:hAnsi="Times New Roman" w:cs="Times New Roman"/>
+          <w:sz w:val="24"/>
+          <w:szCs w:val="24"/>
+          <w:shd w:val="clear" w:color="auto" w:fill="FFFFFF"/>
+        </w:rPr>
+        <w:t>Malaysia generates more than </w:t>
+      </w:r>
+      <w:r>
+        <w:rPr>
+          <w:rStyle w:val="Strong"/>
+          <w:rFonts w:ascii="Times New Roman" w:hAnsi="Times New Roman" w:cs="Times New Roman"/>
+          <w:b w:val="0"/>
+          <w:bCs w:val="0"/>
+          <w:sz w:val="24"/>
+          <w:szCs w:val="24"/>
+          <w:shd w:val="clear" w:color="auto" w:fill="FFFFFF"/>
+        </w:rPr>
+        <w:t>39,000 tonnes of solid waste every single day</w:t>
+      </w:r>
+      <w:r>
+        <w:rPr>
+          <w:rFonts w:ascii="Times New Roman" w:hAnsi="Times New Roman" w:cs="Times New Roman"/>
+          <w:sz w:val="24"/>
+          <w:szCs w:val="24"/>
+          <w:shd w:val="clear" w:color="auto" w:fill="FFFFFF"/>
+        </w:rPr>
+        <w:t>.</w:t>
+      </w:r>
+      <w:r>
+        <w:rPr>
+          <w:rFonts w:ascii="Times New Roman" w:hAnsi="Times New Roman" w:cs="Times New Roman"/>
+          <w:sz w:val="24"/>
+          <w:szCs w:val="24"/>
+          <w:shd w:val="clear" w:color="auto" w:fill="FFFFFF"/>
+        </w:rPr>
+        <w:t xml:space="preserve"> That is roughly 1.17 kg per person</w:t>
+      </w:r>
+      <w:r>
+        <w:rPr>
+          <w:rFonts w:ascii="Times New Roman" w:hAnsi="Times New Roman" w:cs="Times New Roman"/>
+          <w:sz w:val="24"/>
+          <w:szCs w:val="24"/>
+          <w:shd w:val="clear" w:color="auto" w:fill="FFFFFF"/>
+        </w:rPr>
+        <w:t xml:space="preserve"> which is</w:t>
+      </w:r>
+      <w:r>
+        <w:rPr>
+          <w:rFonts w:ascii="Times New Roman" w:hAnsi="Times New Roman" w:cs="Times New Roman"/>
+          <w:sz w:val="24"/>
+          <w:szCs w:val="24"/>
+          <w:shd w:val="clear" w:color="auto" w:fill="FFFFFF"/>
+        </w:rPr>
+        <w:t xml:space="preserve"> </w:t>
+      </w:r>
+      <w:r>
+        <w:rPr>
+          <w:rFonts w:ascii="Times New Roman" w:hAnsi="Times New Roman" w:cs="Times New Roman"/>
+          <w:sz w:val="24"/>
+          <w:szCs w:val="24"/>
+          <w:shd w:val="clear" w:color="auto" w:fill="FFFFFF"/>
+        </w:rPr>
+        <w:t>above the global average</w:t>
+      </w:r>
+      <w:r>
+        <w:rPr>
+          <w:rFonts w:ascii="Times New Roman" w:hAnsi="Times New Roman" w:cs="Times New Roman"/>
+          <w:sz w:val="24"/>
+          <w:szCs w:val="24"/>
+          <w:shd w:val="clear" w:color="auto" w:fill="FFFFFF"/>
+        </w:rPr>
+        <w:t xml:space="preserve">, </w:t>
+      </w:r>
+      <w:r>
+        <w:rPr>
+          <w:rFonts w:ascii="Times New Roman" w:hAnsi="Times New Roman" w:cs="Times New Roman"/>
+          <w:sz w:val="24"/>
+          <w:szCs w:val="24"/>
+          <w:shd w:val="clear" w:color="auto" w:fill="FFFFFF"/>
+        </w:rPr>
+        <w:t>and the number keeps climbing.</w:t>
+      </w:r>
+      <w:sdt>
+        <w:sdtPr>
+          <w:rPr>
+            <w:rFonts w:ascii="Times New Roman" w:hAnsi="Times New Roman" w:cs="Times New Roman"/>
+            <w:sz w:val="24"/>
+            <w:szCs w:val="24"/>
+            <w:shd w:val="clear" w:color="auto" w:fill="FFFFFF"/>
+          </w:rPr>
+          <w:id w:val="1352609819"/>
+          <w:citation/>
+        </w:sdtPr>
+        <w:sdtContent>
+          <w:r>
+            <w:rPr>
+              <w:rFonts w:ascii="Times New Roman" w:hAnsi="Times New Roman" w:cs="Times New Roman"/>
+              <w:sz w:val="24"/>
+              <w:szCs w:val="24"/>
+              <w:shd w:val="clear" w:color="auto" w:fill="FFFFFF"/>
+            </w:rPr>
+            <w:fldChar w:fldCharType="begin"/>
+          </w:r>
+          <w:r>
+            <w:rPr>
+              <w:rFonts w:ascii="Times New Roman" w:hAnsi="Times New Roman" w:cs="Times New Roman"/>
+              <w:sz w:val="24"/>
+              <w:szCs w:val="24"/>
+              <w:shd w:val="clear" w:color="auto" w:fill="FFFFFF"/>
+              <w:lang w:val="en-US"/>
+            </w:rPr>
+            <w:instrText xml:space="preserve">CITATION Cha26 \l 1033 </w:instrText>
+          </w:r>
+          <w:r>
+            <w:rPr>
+              <w:rFonts w:ascii="Times New Roman" w:hAnsi="Times New Roman" w:cs="Times New Roman"/>
+              <w:sz w:val="24"/>
+              <w:szCs w:val="24"/>
+              <w:shd w:val="clear" w:color="auto" w:fill="FFFFFF"/>
+            </w:rPr>
+            <w:fldChar w:fldCharType="separate"/>
+          </w:r>
+          <w:r>
+            <w:rPr>
+              <w:rFonts w:ascii="Times New Roman" w:hAnsi="Times New Roman" w:cs="Times New Roman"/>
+              <w:noProof/>
+              <w:sz w:val="24"/>
+              <w:szCs w:val="24"/>
+              <w:shd w:val="clear" w:color="auto" w:fill="FFFFFF"/>
+            </w:rPr>
+            <w:t xml:space="preserve"> </w:t>
+          </w:r>
+          <w:r>
+            <w:rPr>
+              <w:rFonts w:ascii="Times New Roman" w:hAnsi="Times New Roman" w:cs="Times New Roman"/>
+              <w:noProof/>
+              <w:sz w:val="24"/>
+              <w:szCs w:val="24"/>
+              <w:shd w:val="clear" w:color="auto" w:fill="FFFFFF"/>
+            </w:rPr>
+            <w:t>(Chang Wei Jie, April 23, 2026)</w:t>
+          </w:r>
+          <w:r>
+            <w:rPr>
+              <w:rFonts w:ascii="Times New Roman" w:hAnsi="Times New Roman" w:cs="Times New Roman"/>
+              <w:sz w:val="24"/>
+              <w:szCs w:val="24"/>
+              <w:shd w:val="clear" w:color="auto" w:fill="FFFFFF"/>
+            </w:rPr>
+            <w:fldChar w:fldCharType="end"/>
+          </w:r>
+        </w:sdtContent>
+      </w:sdt>
+      <w:r>
+        <w:rPr>
+          <w:rFonts w:ascii="Times New Roman" w:hAnsi="Times New Roman" w:cs="Times New Roman"/>
+          <w:sz w:val="24"/>
+          <w:szCs w:val="24"/>
+          <w:shd w:val="clear" w:color="auto" w:fill="FFFFFF"/>
+        </w:rPr>
+        <w:t>. This increasing crisis damages our food ecosystem, the environment, and the economy including the unwanted consumption of water, land and resource used for food production.</w:t>
+      </w:r>
+    </w:p>
+    <w:p>
+      <w:pPr>
+        <w:spacing w:before="240" w:line="360" w:lineRule="auto"/>
+        <w:jc w:val="both"/>
+        <w:rPr>
+          <w:rFonts w:ascii="Times New Roman" w:hAnsi="Times New Roman" w:cs="Times New Roman"/>
+          <w:sz w:val="24"/>
+          <w:szCs w:val="24"/>
+        </w:rPr>
+      </w:pPr>
+      <w:r>
+        <w:rPr>
+          <w:rFonts w:ascii="Times New Roman" w:hAnsi="Times New Roman" w:cs="Times New Roman"/>
+          <w:sz w:val="24"/>
+          <w:szCs w:val="24"/>
+        </w:rPr>
+        <w:t>To reduce the major problem of food waste, household food waste, Saveplate is a smart web application (an intelligent inventory management system), we have designed to help users/customers manage their food inventory, track the expiration dates, receive timely alerts</w:t>
+      </w:r>
+      <w:r>
+        <w:rPr>
+          <w:rFonts w:ascii="Times New Roman" w:hAnsi="Times New Roman" w:cs="Times New Roman"/>
+          <w:sz w:val="24"/>
+          <w:szCs w:val="24"/>
+        </w:rPr>
+        <w:t xml:space="preserve"> and notifications</w:t>
+      </w:r>
+      <w:r>
+        <w:rPr>
+          <w:rFonts w:ascii="Times New Roman" w:hAnsi="Times New Roman" w:cs="Times New Roman"/>
+          <w:sz w:val="24"/>
+          <w:szCs w:val="24"/>
+        </w:rPr>
+        <w:t>,</w:t>
+      </w:r>
+      <w:r>
+        <w:rPr>
+          <w:rFonts w:ascii="Times New Roman" w:hAnsi="Times New Roman" w:cs="Times New Roman"/>
+          <w:sz w:val="24"/>
+          <w:szCs w:val="24"/>
+        </w:rPr>
+        <w:t xml:space="preserve"> search for food items, food analytics,</w:t>
+      </w:r>
+      <w:r>
+        <w:rPr>
+          <w:rFonts w:ascii="Times New Roman" w:hAnsi="Times New Roman" w:cs="Times New Roman"/>
+          <w:sz w:val="24"/>
+          <w:szCs w:val="24"/>
+        </w:rPr>
+        <w:t xml:space="preserve"> facilities for donation and with added functionality for meal planning.</w:t>
+      </w:r>
+      <w:r>
+        <w:rPr>
+          <w:rFonts w:ascii="Times New Roman" w:hAnsi="Times New Roman" w:cs="Times New Roman"/>
+          <w:sz w:val="24"/>
+          <w:szCs w:val="24"/>
+        </w:rPr>
+        <w:t xml:space="preserve"> </w:t>
+      </w:r>
+      <w:r>
+        <w:rPr>
+          <w:rFonts w:ascii="Times New Roman" w:hAnsi="Times New Roman" w:cs="Times New Roman"/>
+          <w:sz w:val="24"/>
+          <w:szCs w:val="24"/>
+        </w:rPr>
+        <w:t>While doing we have g</w:t>
+      </w:r>
+      <w:r>
+        <w:rPr>
+          <w:rFonts w:ascii="Times New Roman" w:hAnsi="Times New Roman" w:cs="Times New Roman"/>
+          <w:sz w:val="24"/>
+          <w:szCs w:val="24"/>
+        </w:rPr>
+        <w:t>iven</w:t>
+      </w:r>
+      <w:r>
+        <w:rPr>
+          <w:rFonts w:ascii="Times New Roman" w:hAnsi="Times New Roman" w:cs="Times New Roman"/>
+          <w:sz w:val="24"/>
+          <w:szCs w:val="24"/>
+        </w:rPr>
+        <w:t xml:space="preserve"> our attention towards protecting user data and account privacy.</w:t>
+      </w:r>
+      <w:r>
+        <w:rPr>
+          <w:rFonts w:ascii="Times New Roman" w:hAnsi="Times New Roman" w:cs="Times New Roman"/>
+          <w:sz w:val="24"/>
+          <w:szCs w:val="24"/>
+        </w:rPr>
+        <w:t xml:space="preserve"> </w:t>
+      </w:r>
+    </w:p>
+    <w:p>
+      <w:pPr>
+        <w:pStyle w:val="sub-heading2"/>
+      </w:pPr>
+      <w:r>
+        <w:t>Motivation</w:t>
+      </w:r>
+    </w:p>
+    <w:p>
+      <w:pPr>
+        <w:spacing w:before="240" w:line="360" w:lineRule="auto"/>
+        <w:jc w:val="both"/>
+        <w:rPr>
+          <w:rFonts w:ascii="Times New Roman" w:hAnsi="Times New Roman" w:cs="Times New Roman"/>
+          <w:sz w:val="24"/>
+          <w:szCs w:val="24"/>
+          <w:shd w:val="clear" w:color="auto" w:fill="FFFFFF"/>
+        </w:rPr>
+      </w:pPr>
+      <w:r>
+        <w:rPr>
+          <w:rFonts w:ascii="Times New Roman" w:hAnsi="Times New Roman" w:cs="Times New Roman"/>
+          <w:sz w:val="24"/>
+          <w:szCs w:val="24"/>
+        </w:rPr>
+        <w:t>The main motivation for this project comes from the increasing concern of food</w:t>
+      </w:r>
+      <w:r>
+        <w:rPr>
+          <w:rFonts w:ascii="Times New Roman" w:hAnsi="Times New Roman" w:cs="Times New Roman"/>
+          <w:sz w:val="24"/>
+          <w:szCs w:val="24"/>
+        </w:rPr>
+        <w:t xml:space="preserve"> waste</w:t>
+      </w:r>
+      <w:r>
+        <w:rPr>
+          <w:rFonts w:ascii="Times New Roman" w:hAnsi="Times New Roman" w:cs="Times New Roman"/>
+          <w:sz w:val="24"/>
+          <w:szCs w:val="24"/>
+        </w:rPr>
+        <w:t xml:space="preserve"> and its impact on environment</w:t>
+      </w:r>
+      <w:r>
+        <w:rPr>
+          <w:rFonts w:ascii="Times New Roman" w:hAnsi="Times New Roman" w:cs="Times New Roman"/>
+          <w:sz w:val="24"/>
+          <w:szCs w:val="24"/>
+        </w:rPr>
+        <w:t>al</w:t>
+      </w:r>
+      <w:r>
+        <w:rPr>
+          <w:rFonts w:ascii="Times New Roman" w:hAnsi="Times New Roman" w:cs="Times New Roman"/>
+          <w:sz w:val="24"/>
+          <w:szCs w:val="24"/>
+        </w:rPr>
+        <w:t xml:space="preserve"> and economic factors.</w:t>
+      </w:r>
+      <w:r>
+        <w:rPr>
+          <w:rFonts w:ascii="Times New Roman" w:hAnsi="Times New Roman" w:cs="Times New Roman"/>
+          <w:sz w:val="24"/>
+          <w:szCs w:val="24"/>
+        </w:rPr>
+        <w:t xml:space="preserve"> </w:t>
+      </w:r>
+      <w:r>
+        <w:rPr>
+          <w:rFonts w:ascii="Times New Roman" w:hAnsi="Times New Roman" w:cs="Times New Roman"/>
+          <w:sz w:val="24"/>
+          <w:szCs w:val="24"/>
+        </w:rPr>
+        <w:t>As in Malaysia and everywhere, food is central to our daily needs and our culture, and still the gap between food consumption and food management is huge</w:t>
+      </w:r>
+      <w:r>
+        <w:rPr>
+          <w:rFonts w:ascii="Times New Roman" w:hAnsi="Times New Roman" w:cs="Times New Roman"/>
+          <w:sz w:val="24"/>
+          <w:szCs w:val="24"/>
+        </w:rPr>
+        <w:t>. Here is a number to get a better picture,</w:t>
+      </w:r>
+      <w:r>
+        <w:rPr>
+          <w:rFonts w:ascii="Poppins" w:hAnsi="Poppins" w:cs="Poppins"/>
+          <w:sz w:val="27"/>
+          <w:szCs w:val="27"/>
+          <w:shd w:val="clear" w:color="auto" w:fill="FFFFFF"/>
+        </w:rPr>
+        <w:t xml:space="preserve"> </w:t>
+      </w:r>
+      <w:r>
+        <w:rPr>
+          <w:rFonts w:ascii="Times New Roman" w:hAnsi="Times New Roman" w:cs="Times New Roman"/>
+          <w:sz w:val="24"/>
+          <w:szCs w:val="24"/>
+          <w:shd w:val="clear" w:color="auto" w:fill="FFFFFF"/>
+        </w:rPr>
+        <w:t>Malaysia produced 15.2 million tonnes in 2024 and is projected to reach </w:t>
+      </w:r>
+      <w:r>
+        <w:rPr>
+          <w:rStyle w:val="Strong"/>
+          <w:rFonts w:ascii="Times New Roman" w:hAnsi="Times New Roman" w:cs="Times New Roman"/>
+          <w:b w:val="0"/>
+          <w:bCs w:val="0"/>
+          <w:sz w:val="24"/>
+          <w:szCs w:val="24"/>
+          <w:shd w:val="clear" w:color="auto" w:fill="FFFFFF"/>
+        </w:rPr>
+        <w:t>17.03 million tonnes by 2035</w:t>
+      </w:r>
+      <w:r>
+        <w:rPr>
+          <w:rFonts w:ascii="Times New Roman" w:hAnsi="Times New Roman" w:cs="Times New Roman"/>
+          <w:sz w:val="24"/>
+          <w:szCs w:val="24"/>
+          <w:shd w:val="clear" w:color="auto" w:fill="FFFFFF"/>
+        </w:rPr>
+        <w:t>.</w:t>
+      </w:r>
+      <w:sdt>
+        <w:sdtPr>
+          <w:rPr>
+            <w:rFonts w:ascii="Times New Roman" w:hAnsi="Times New Roman" w:cs="Times New Roman"/>
+            <w:sz w:val="24"/>
+            <w:szCs w:val="24"/>
+            <w:shd w:val="clear" w:color="auto" w:fill="FFFFFF"/>
+          </w:rPr>
+          <w:id w:val="460768552"/>
+          <w:citation/>
+        </w:sdtPr>
+        <w:sdtContent>
+          <w:r>
+            <w:rPr>
+              <w:rFonts w:ascii="Times New Roman" w:hAnsi="Times New Roman" w:cs="Times New Roman"/>
+              <w:sz w:val="24"/>
+              <w:szCs w:val="24"/>
+              <w:shd w:val="clear" w:color="auto" w:fill="FFFFFF"/>
+            </w:rPr>
+            <w:fldChar w:fldCharType="begin"/>
+          </w:r>
+          <w:r>
+            <w:rPr>
+              <w:rFonts w:ascii="Times New Roman" w:hAnsi="Times New Roman" w:cs="Times New Roman"/>
+              <w:sz w:val="24"/>
+              <w:szCs w:val="24"/>
+              <w:shd w:val="clear" w:color="auto" w:fill="FFFFFF"/>
+              <w:lang w:val="en-US"/>
+            </w:rPr>
+            <w:instrText xml:space="preserve">CITATION Cha26 \l 1033 </w:instrText>
+          </w:r>
+          <w:r>
+            <w:rPr>
+              <w:rFonts w:ascii="Times New Roman" w:hAnsi="Times New Roman" w:cs="Times New Roman"/>
+              <w:sz w:val="24"/>
+              <w:szCs w:val="24"/>
+              <w:shd w:val="clear" w:color="auto" w:fill="FFFFFF"/>
+            </w:rPr>
+            <w:fldChar w:fldCharType="separate"/>
+          </w:r>
+          <w:r>
+            <w:rPr>
+              <w:rFonts w:ascii="Times New Roman" w:hAnsi="Times New Roman" w:cs="Times New Roman"/>
+              <w:noProof/>
+              <w:sz w:val="24"/>
+              <w:szCs w:val="24"/>
+              <w:shd w:val="clear" w:color="auto" w:fill="FFFFFF"/>
+            </w:rPr>
+            <w:t xml:space="preserve"> </w:t>
+          </w:r>
+          <w:r>
+            <w:rPr>
+              <w:rFonts w:ascii="Times New Roman" w:hAnsi="Times New Roman" w:cs="Times New Roman"/>
+              <w:noProof/>
+              <w:sz w:val="24"/>
+              <w:szCs w:val="24"/>
+              <w:shd w:val="clear" w:color="auto" w:fill="FFFFFF"/>
+            </w:rPr>
+            <w:t>(Chang Wei Jie, April 23, 2026)</w:t>
+          </w:r>
+          <w:r>
+            <w:rPr>
+              <w:rFonts w:ascii="Times New Roman" w:hAnsi="Times New Roman" w:cs="Times New Roman"/>
+              <w:sz w:val="24"/>
+              <w:szCs w:val="24"/>
+              <w:shd w:val="clear" w:color="auto" w:fill="FFFFFF"/>
+            </w:rPr>
+            <w:fldChar w:fldCharType="end"/>
+          </w:r>
+        </w:sdtContent>
+      </w:sdt>
+    </w:p>
+    <w:p>
+      <w:pPr>
+        <w:spacing w:before="240" w:line="360" w:lineRule="auto"/>
+        <w:jc w:val="both"/>
+        <w:rPr>
+          <w:rFonts w:ascii="Times New Roman" w:hAnsi="Times New Roman" w:cs="Times New Roman"/>
+          <w:sz w:val="24"/>
+          <w:szCs w:val="24"/>
+          <w:shd w:val="clear" w:color="auto" w:fill="FFFFFF"/>
+        </w:rPr>
+      </w:pPr>
+      <w:r>
+        <w:rPr>
+          <w:rFonts w:ascii="Times New Roman" w:hAnsi="Times New Roman" w:cs="Times New Roman"/>
+          <w:sz w:val="24"/>
+          <w:szCs w:val="24"/>
+          <w:shd w:val="clear" w:color="auto" w:fill="FFFFFF"/>
+        </w:rPr>
+        <w:t>With this increasing issue, SavePlate is motivated to help minimize the food wastage and the proper management of the food and resources.</w:t>
+      </w:r>
+    </w:p>
+    <w:p>
+      <w:pPr>
+        <w:pStyle w:val="sub-heading2"/>
+      </w:pPr>
+      <w:r>
+        <w:t>Customers and Users</w:t>
+      </w:r>
+    </w:p>
+    <w:p>
+      <w:pPr>
+        <w:rPr>
+          <w:rFonts w:ascii="Times New Roman" w:hAnsi="Times New Roman" w:cs="Times New Roman"/>
+          <w:sz w:val="24"/>
+          <w:szCs w:val="24"/>
+        </w:rPr>
+      </w:pPr>
+      <w:r>
+        <w:rPr>
+          <w:rFonts w:ascii="Times New Roman" w:hAnsi="Times New Roman" w:cs="Times New Roman"/>
+          <w:sz w:val="24"/>
+          <w:szCs w:val="24"/>
+        </w:rPr>
+        <w:t>The primary users for the SavePlate are:</w:t>
       </w:r>
     </w:p>
     <w:p>
@@ -419,101 +648,27 @@
           <w:ilvl w:val="0"/>
           <w:numId w:val="7"/>
         </w:numPr>
-        <w:spacing w:line="360" w:lineRule="auto"/>
-        <w:jc w:val="both"/>
-        <w:rPr>
-          <w:rFonts w:ascii="Times New Roman" w:hAnsi="Times New Roman" w:cs="Times New Roman"/>
-          <w:b/>
-          <w:bCs/>
-          <w:sz w:val="24"/>
-          <w:szCs w:val="24"/>
-        </w:rPr>
-      </w:pPr>
-      <w:r>
-        <w:rPr>
-          <w:rFonts w:ascii="Times New Roman" w:hAnsi="Times New Roman" w:cs="Times New Roman"/>
-          <w:sz w:val="24"/>
-          <w:szCs w:val="24"/>
-        </w:rPr>
-        <w:br w:type="page"/>
-      </w:r>
-      <w:r>
-        <w:rPr>
-          <w:rFonts w:ascii="Times New Roman" w:hAnsi="Times New Roman" w:cs="Times New Roman"/>
-          <w:b/>
-          <w:bCs/>
-          <w:sz w:val="24"/>
-          <w:szCs w:val="24"/>
-        </w:rPr>
-        <w:lastRenderedPageBreak/>
-        <w:t>Overview</w:t>
-      </w:r>
-    </w:p>
-    <w:p>
-      <w:pPr>
-        <w:spacing w:line="360" w:lineRule="auto"/>
-        <w:ind w:left="720"/>
-        <w:jc w:val="both"/>
-        <w:rPr>
-          <w:rFonts w:ascii="Times New Roman" w:hAnsi="Times New Roman" w:cs="Times New Roman"/>
-          <w:sz w:val="24"/>
-          <w:szCs w:val="24"/>
-        </w:rPr>
-      </w:pPr>
-      <w:proofErr w:type="spellStart"/>
-      <w:r>
-        <w:rPr>
-          <w:rFonts w:ascii="Times New Roman" w:hAnsi="Times New Roman" w:cs="Times New Roman"/>
-          <w:sz w:val="24"/>
-          <w:szCs w:val="24"/>
-        </w:rPr>
-        <w:t>SavePlate</w:t>
-      </w:r>
-      <w:proofErr w:type="spellEnd"/>
-      <w:r>
-        <w:rPr>
-          <w:rFonts w:ascii="Times New Roman" w:hAnsi="Times New Roman" w:cs="Times New Roman"/>
-          <w:sz w:val="24"/>
-          <w:szCs w:val="24"/>
-        </w:rPr>
-        <w:t xml:space="preserve"> is a smart web application designed to reduce household food waste by helping users to mage their food inventory, track expiration dates, and receive timely alerts. The motivation for this project arises from the increasing concern over food wastage and its environmental and economic impacts.</w:t>
-      </w:r>
-    </w:p>
-    <w:p>
-      <w:pPr>
-        <w:spacing w:line="360" w:lineRule="auto"/>
-        <w:ind w:left="720"/>
-        <w:jc w:val="both"/>
-        <w:rPr>
-          <w:rFonts w:ascii="Times New Roman" w:hAnsi="Times New Roman" w:cs="Times New Roman"/>
-          <w:sz w:val="24"/>
-          <w:szCs w:val="24"/>
-        </w:rPr>
-      </w:pPr>
-      <w:r>
-        <w:rPr>
-          <w:rFonts w:ascii="Times New Roman" w:hAnsi="Times New Roman" w:cs="Times New Roman"/>
-          <w:sz w:val="24"/>
-          <w:szCs w:val="24"/>
-        </w:rPr>
-        <w:t>The primary users include households, individuals, and donors who wish to manage their food efficiently. The system will be developed as a web-based application that enables inventory tracking, notifications, and meal planning. The estimated cost is minimal as open-source tools will be used, and the development timeline is approximately 6-8 weeks.</w:t>
-      </w:r>
-    </w:p>
-    <w:p>
-      <w:pPr>
-        <w:rPr>
-          <w:rFonts w:ascii="Times New Roman" w:hAnsi="Times New Roman" w:cs="Times New Roman"/>
-          <w:sz w:val="24"/>
-          <w:szCs w:val="24"/>
-        </w:rPr>
-      </w:pPr>
-      <w:r>
-        <w:rPr>
-          <w:rFonts w:ascii="Times New Roman" w:hAnsi="Times New Roman" w:cs="Times New Roman"/>
-          <w:sz w:val="24"/>
-          <w:szCs w:val="24"/>
-        </w:rPr>
-        <w:br w:type="page"/>
+        <w:rPr>
+          <w:rFonts w:ascii="Times New Roman" w:hAnsi="Times New Roman" w:cs="Times New Roman"/>
+          <w:sz w:val="24"/>
+          <w:szCs w:val="24"/>
+        </w:rPr>
+      </w:pPr>
+      <w:r>
+        <w:rPr>
+          <w:rFonts w:ascii="Times New Roman" w:hAnsi="Times New Roman" w:cs="Times New Roman"/>
+          <w:sz w:val="24"/>
+          <w:szCs w:val="24"/>
+        </w:rPr>
+        <w:t>Families and household individuals</w:t>
+      </w:r>
+      <w:r>
+        <w:rPr>
+          <w:rFonts w:ascii="Times New Roman" w:hAnsi="Times New Roman" w:cs="Times New Roman"/>
+          <w:sz w:val="24"/>
+          <w:szCs w:val="24"/>
+        </w:rPr>
+        <w:t>, who in regular basis purchase and consume food items,</w:t>
       </w:r>
     </w:p>
     <w:p>
@@ -523,7 +678,700 @@
           <w:ilvl w:val="0"/>
           <w:numId w:val="7"/>
         </w:numPr>
-        <w:spacing w:line="360" w:lineRule="auto"/>
+        <w:rPr>
+          <w:rFonts w:ascii="Times New Roman" w:hAnsi="Times New Roman" w:cs="Times New Roman"/>
+          <w:sz w:val="24"/>
+          <w:szCs w:val="24"/>
+        </w:rPr>
+      </w:pPr>
+      <w:r>
+        <w:rPr>
+          <w:rFonts w:ascii="Times New Roman" w:hAnsi="Times New Roman" w:cs="Times New Roman"/>
+          <w:sz w:val="24"/>
+          <w:szCs w:val="24"/>
+        </w:rPr>
+        <w:t>Donors who are willing to share the food with others, before it goes to waste,</w:t>
+      </w:r>
+    </w:p>
+    <w:p>
+      <w:pPr>
+        <w:pStyle w:val="ListParagraph"/>
+        <w:numPr>
+          <w:ilvl w:val="0"/>
+          <w:numId w:val="7"/>
+        </w:numPr>
+        <w:rPr>
+          <w:rFonts w:ascii="Times New Roman" w:hAnsi="Times New Roman" w:cs="Times New Roman"/>
+          <w:sz w:val="24"/>
+          <w:szCs w:val="24"/>
+        </w:rPr>
+      </w:pPr>
+      <w:r>
+        <w:rPr>
+          <w:rFonts w:ascii="Times New Roman" w:hAnsi="Times New Roman" w:cs="Times New Roman"/>
+          <w:sz w:val="24"/>
+          <w:szCs w:val="24"/>
+        </w:rPr>
+        <w:t>Community members and individuals who can browse and claim the donated food items,</w:t>
+      </w:r>
+    </w:p>
+    <w:p>
+      <w:pPr>
+        <w:pStyle w:val="ListParagraph"/>
+        <w:numPr>
+          <w:ilvl w:val="0"/>
+          <w:numId w:val="7"/>
+        </w:numPr>
+        <w:rPr>
+          <w:rFonts w:ascii="Times New Roman" w:hAnsi="Times New Roman" w:cs="Times New Roman"/>
+          <w:sz w:val="24"/>
+          <w:szCs w:val="24"/>
+        </w:rPr>
+      </w:pPr>
+      <w:r>
+        <w:rPr>
+          <w:rFonts w:ascii="Times New Roman" w:hAnsi="Times New Roman" w:cs="Times New Roman"/>
+          <w:sz w:val="24"/>
+          <w:szCs w:val="24"/>
+        </w:rPr>
+        <w:t>Everyday individuals, who wants to track the expiry dates of the food items,</w:t>
+      </w:r>
+    </w:p>
+    <w:p>
+      <w:pPr>
+        <w:pStyle w:val="sub-heading2"/>
+      </w:pPr>
+      <w:r>
+        <w:lastRenderedPageBreak/>
+        <w:t>Project Deliverables</w:t>
+      </w:r>
+    </w:p>
+    <w:p>
+      <w:pPr>
+        <w:spacing w:before="240" w:line="360" w:lineRule="auto"/>
+        <w:rPr>
+          <w:rFonts w:ascii="Times New Roman" w:hAnsi="Times New Roman" w:cs="Times New Roman"/>
+          <w:sz w:val="24"/>
+          <w:szCs w:val="24"/>
+        </w:rPr>
+      </w:pPr>
+      <w:r>
+        <w:rPr>
+          <w:rFonts w:ascii="Times New Roman" w:hAnsi="Times New Roman" w:cs="Times New Roman"/>
+          <w:sz w:val="24"/>
+          <w:szCs w:val="24"/>
+        </w:rPr>
+        <w:t>Our product is a new product, and not an extension of any existing project. Built to address food waste management for Malaysian households. SavePlate will be delivered as a fully functional, web-based application accessible via web browser.</w:t>
+      </w:r>
+    </w:p>
+    <w:p>
+      <w:pPr>
+        <w:spacing w:before="240" w:line="360" w:lineRule="auto"/>
+        <w:rPr>
+          <w:rFonts w:ascii="Times New Roman" w:hAnsi="Times New Roman" w:cs="Times New Roman"/>
+          <w:sz w:val="24"/>
+          <w:szCs w:val="24"/>
+        </w:rPr>
+      </w:pPr>
+      <w:r>
+        <w:rPr>
+          <w:rFonts w:ascii="Times New Roman" w:hAnsi="Times New Roman" w:cs="Times New Roman"/>
+          <w:sz w:val="24"/>
+          <w:szCs w:val="24"/>
+        </w:rPr>
+        <w:t>The core features to be delivered include:</w:t>
+      </w:r>
+    </w:p>
+    <w:p>
+      <w:pPr>
+        <w:pStyle w:val="ListParagraph"/>
+        <w:numPr>
+          <w:ilvl w:val="0"/>
+          <w:numId w:val="8"/>
+        </w:numPr>
+        <w:spacing w:before="240" w:line="360" w:lineRule="auto"/>
+        <w:rPr>
+          <w:rFonts w:ascii="Times New Roman" w:hAnsi="Times New Roman" w:cs="Times New Roman"/>
+          <w:sz w:val="24"/>
+          <w:szCs w:val="24"/>
+        </w:rPr>
+      </w:pPr>
+      <w:r>
+        <w:rPr>
+          <w:rFonts w:ascii="Times New Roman" w:hAnsi="Times New Roman" w:cs="Times New Roman"/>
+          <w:sz w:val="24"/>
+          <w:szCs w:val="24"/>
+        </w:rPr>
+        <w:t>User registration and account privacy,</w:t>
+      </w:r>
+    </w:p>
+    <w:p>
+      <w:pPr>
+        <w:pStyle w:val="ListParagraph"/>
+        <w:numPr>
+          <w:ilvl w:val="0"/>
+          <w:numId w:val="8"/>
+        </w:numPr>
+        <w:spacing w:before="240" w:line="360" w:lineRule="auto"/>
+        <w:rPr>
+          <w:rFonts w:ascii="Times New Roman" w:hAnsi="Times New Roman" w:cs="Times New Roman"/>
+          <w:sz w:val="24"/>
+          <w:szCs w:val="24"/>
+        </w:rPr>
+      </w:pPr>
+      <w:r>
+        <w:rPr>
+          <w:rFonts w:ascii="Times New Roman" w:hAnsi="Times New Roman" w:cs="Times New Roman"/>
+          <w:sz w:val="24"/>
+          <w:szCs w:val="24"/>
+        </w:rPr>
+        <w:t>Two-Factor authentication and privacy management</w:t>
+      </w:r>
+      <w:r>
+        <w:rPr>
+          <w:rFonts w:ascii="Times New Roman" w:hAnsi="Times New Roman" w:cs="Times New Roman"/>
+          <w:sz w:val="24"/>
+          <w:szCs w:val="24"/>
+        </w:rPr>
+        <w:t>,</w:t>
+      </w:r>
+    </w:p>
+    <w:p>
+      <w:pPr>
+        <w:pStyle w:val="ListParagraph"/>
+        <w:numPr>
+          <w:ilvl w:val="0"/>
+          <w:numId w:val="8"/>
+        </w:numPr>
+        <w:spacing w:before="240" w:line="360" w:lineRule="auto"/>
+        <w:rPr>
+          <w:rFonts w:ascii="Times New Roman" w:hAnsi="Times New Roman" w:cs="Times New Roman"/>
+          <w:sz w:val="24"/>
+          <w:szCs w:val="24"/>
+        </w:rPr>
+      </w:pPr>
+      <w:r>
+        <w:rPr>
+          <w:rFonts w:ascii="Times New Roman" w:hAnsi="Times New Roman" w:cs="Times New Roman"/>
+          <w:sz w:val="24"/>
+          <w:szCs w:val="24"/>
+        </w:rPr>
+        <w:t>Food inventory management with tracking expiry dates,</w:t>
+      </w:r>
+    </w:p>
+    <w:p>
+      <w:pPr>
+        <w:pStyle w:val="ListParagraph"/>
+        <w:numPr>
+          <w:ilvl w:val="0"/>
+          <w:numId w:val="8"/>
+        </w:numPr>
+        <w:spacing w:before="240" w:line="360" w:lineRule="auto"/>
+        <w:rPr>
+          <w:rFonts w:ascii="Times New Roman" w:hAnsi="Times New Roman" w:cs="Times New Roman"/>
+          <w:sz w:val="24"/>
+          <w:szCs w:val="24"/>
+        </w:rPr>
+      </w:pPr>
+      <w:r>
+        <w:rPr>
+          <w:rFonts w:ascii="Times New Roman" w:hAnsi="Times New Roman" w:cs="Times New Roman"/>
+          <w:sz w:val="24"/>
+          <w:szCs w:val="24"/>
+        </w:rPr>
+        <w:t>Food donation – donating and cleaning food items,</w:t>
+      </w:r>
+    </w:p>
+    <w:p>
+      <w:pPr>
+        <w:pStyle w:val="ListParagraph"/>
+        <w:numPr>
+          <w:ilvl w:val="0"/>
+          <w:numId w:val="8"/>
+        </w:numPr>
+        <w:spacing w:before="240" w:line="360" w:lineRule="auto"/>
+        <w:rPr>
+          <w:rFonts w:ascii="Times New Roman" w:hAnsi="Times New Roman" w:cs="Times New Roman"/>
+          <w:sz w:val="24"/>
+          <w:szCs w:val="24"/>
+        </w:rPr>
+      </w:pPr>
+      <w:r>
+        <w:rPr>
+          <w:rFonts w:ascii="Times New Roman" w:hAnsi="Times New Roman" w:cs="Times New Roman"/>
+          <w:sz w:val="24"/>
+          <w:szCs w:val="24"/>
+        </w:rPr>
+        <w:t>Real time notification system for expiry and donations,</w:t>
+      </w:r>
+    </w:p>
+    <w:p>
+      <w:pPr>
+        <w:pStyle w:val="ListParagraph"/>
+        <w:numPr>
+          <w:ilvl w:val="0"/>
+          <w:numId w:val="8"/>
+        </w:numPr>
+        <w:spacing w:before="240" w:line="360" w:lineRule="auto"/>
+        <w:rPr>
+          <w:rFonts w:ascii="Times New Roman" w:hAnsi="Times New Roman" w:cs="Times New Roman"/>
+          <w:sz w:val="24"/>
+          <w:szCs w:val="24"/>
+        </w:rPr>
+      </w:pPr>
+      <w:r>
+        <w:rPr>
+          <w:rFonts w:ascii="Times New Roman" w:hAnsi="Times New Roman" w:cs="Times New Roman"/>
+          <w:sz w:val="24"/>
+          <w:szCs w:val="24"/>
+        </w:rPr>
+        <w:t>Food analytics,</w:t>
+      </w:r>
+    </w:p>
+    <w:p>
+      <w:pPr>
+        <w:pStyle w:val="ListParagraph"/>
+        <w:numPr>
+          <w:ilvl w:val="0"/>
+          <w:numId w:val="8"/>
+        </w:numPr>
+        <w:spacing w:before="240" w:line="360" w:lineRule="auto"/>
+        <w:rPr>
+          <w:rFonts w:ascii="Times New Roman" w:hAnsi="Times New Roman" w:cs="Times New Roman"/>
+          <w:sz w:val="24"/>
+          <w:szCs w:val="24"/>
+        </w:rPr>
+      </w:pPr>
+      <w:r>
+        <w:rPr>
+          <w:rFonts w:ascii="Times New Roman" w:hAnsi="Times New Roman" w:cs="Times New Roman"/>
+          <w:sz w:val="24"/>
+          <w:szCs w:val="24"/>
+        </w:rPr>
+        <w:t>Weekly meal planning based on the current food inventory</w:t>
+      </w:r>
+    </w:p>
+    <w:p>
+      <w:pPr>
+        <w:pStyle w:val="sub-heading2"/>
+      </w:pPr>
+      <w:r>
+        <w:t>Cost Estimation</w:t>
+      </w:r>
+    </w:p>
+    <w:p>
+      <w:pPr>
+        <w:pStyle w:val="Normal0"/>
+      </w:pPr>
+      <w:r>
+        <w:t>The project will be developed by our team of three members, contributing our own computing hardware, development will be done all using open-source tools and free available platforms, keeping the development cost minimal.</w:t>
+      </w:r>
+      <w:r>
+        <w:t xml:space="preserve"> </w:t>
+      </w:r>
+    </w:p>
+    <w:p/>
+    <w:p>
+      <w:pPr>
+        <w:pStyle w:val="sub-heading2"/>
+      </w:pPr>
+      <w:r>
+        <w:t>Timeline</w:t>
+      </w:r>
+    </w:p>
+    <w:p>
+      <w:pPr>
+        <w:spacing w:before="240" w:line="360" w:lineRule="auto"/>
+        <w:rPr>
+          <w:rFonts w:ascii="Times New Roman" w:hAnsi="Times New Roman" w:cs="Times New Roman"/>
+          <w:sz w:val="24"/>
+          <w:szCs w:val="24"/>
+        </w:rPr>
+      </w:pPr>
+      <w:r>
+        <w:rPr>
+          <w:rFonts w:ascii="Times New Roman" w:hAnsi="Times New Roman" w:cs="Times New Roman"/>
+          <w:sz w:val="24"/>
+          <w:szCs w:val="24"/>
+        </w:rPr>
+        <w:t xml:space="preserve">The development timeline for the SavePlate is estimated at approximately 6 to 8 weeks, divided into two phases, which is aligned with the assignment submission deadlines, Phase 1 and Phase 2 for coding and testing </w:t>
+      </w:r>
+      <w:r>
+        <w:rPr>
+          <w:rFonts w:ascii="Times New Roman" w:hAnsi="Times New Roman" w:cs="Times New Roman"/>
+          <w:sz w:val="24"/>
+          <w:szCs w:val="24"/>
+        </w:rPr>
+        <w:tab/>
+      </w:r>
+    </w:p>
+    <w:p>
+      <w:pPr>
+        <w:rPr>
+          <w:rFonts w:ascii="Times New Roman" w:hAnsi="Times New Roman" w:cs="Times New Roman"/>
+          <w:sz w:val="24"/>
+          <w:szCs w:val="24"/>
+        </w:rPr>
+      </w:pPr>
+      <w:r>
+        <w:rPr>
+          <w:rFonts w:ascii="Times New Roman" w:hAnsi="Times New Roman" w:cs="Times New Roman"/>
+          <w:sz w:val="24"/>
+          <w:szCs w:val="24"/>
+        </w:rPr>
+        <w:br w:type="page"/>
+      </w:r>
+    </w:p>
+    <w:p>
+      <w:pPr>
+        <w:pStyle w:val="Main-Heading"/>
+      </w:pPr>
+      <w:r>
+        <w:lastRenderedPageBreak/>
+        <w:t>Project Aims</w:t>
+      </w:r>
+    </w:p>
+    <w:p>
+      <w:pPr>
+        <w:pStyle w:val="Normal0"/>
+        <w:spacing w:before="240" w:line="360" w:lineRule="auto"/>
+      </w:pPr>
+      <w:r>
+        <w:t xml:space="preserve">The main aims for the development of </w:t>
+      </w:r>
+      <w:r>
+        <w:t>SavePlate are listed below;</w:t>
+      </w:r>
+    </w:p>
+    <w:p>
+      <w:pPr>
+        <w:pStyle w:val="ListParagraph"/>
+        <w:numPr>
+          <w:ilvl w:val="0"/>
+          <w:numId w:val="9"/>
+        </w:numPr>
+        <w:spacing w:before="240" w:line="360" w:lineRule="auto"/>
+        <w:rPr>
+          <w:rFonts w:ascii="Times New Roman" w:hAnsi="Times New Roman" w:cs="Times New Roman"/>
+          <w:sz w:val="24"/>
+          <w:szCs w:val="24"/>
+        </w:rPr>
+      </w:pPr>
+      <w:r>
+        <w:rPr>
+          <w:rFonts w:ascii="Times New Roman" w:hAnsi="Times New Roman" w:cs="Times New Roman"/>
+          <w:sz w:val="24"/>
+          <w:szCs w:val="24"/>
+        </w:rPr>
+        <w:t>To develop a user friendly, web application that helps Malaysian households to effectively reduce food waste,</w:t>
+      </w:r>
+    </w:p>
+    <w:p>
+      <w:pPr>
+        <w:pStyle w:val="ListParagraph"/>
+        <w:numPr>
+          <w:ilvl w:val="0"/>
+          <w:numId w:val="9"/>
+        </w:numPr>
+        <w:spacing w:before="240" w:line="360" w:lineRule="auto"/>
+        <w:rPr>
+          <w:rFonts w:ascii="Times New Roman" w:hAnsi="Times New Roman" w:cs="Times New Roman"/>
+          <w:sz w:val="24"/>
+          <w:szCs w:val="24"/>
+        </w:rPr>
+      </w:pPr>
+      <w:r>
+        <w:rPr>
+          <w:rFonts w:ascii="Times New Roman" w:hAnsi="Times New Roman" w:cs="Times New Roman"/>
+          <w:sz w:val="24"/>
+          <w:szCs w:val="24"/>
+        </w:rPr>
+        <w:t>To help user adapt to sustainable consumption practice by providing appropriate tools to manage food inventory responsibly and efficiently,</w:t>
+      </w:r>
+    </w:p>
+    <w:p>
+      <w:pPr>
+        <w:pStyle w:val="ListParagraph"/>
+        <w:numPr>
+          <w:ilvl w:val="0"/>
+          <w:numId w:val="9"/>
+        </w:numPr>
+        <w:spacing w:before="240" w:line="360" w:lineRule="auto"/>
+        <w:rPr>
+          <w:rFonts w:ascii="Times New Roman" w:hAnsi="Times New Roman" w:cs="Times New Roman"/>
+          <w:sz w:val="24"/>
+          <w:szCs w:val="24"/>
+        </w:rPr>
+      </w:pPr>
+      <w:r>
+        <w:rPr>
+          <w:rFonts w:ascii="Times New Roman" w:hAnsi="Times New Roman" w:cs="Times New Roman"/>
+          <w:sz w:val="24"/>
+          <w:szCs w:val="24"/>
+        </w:rPr>
+        <w:t>To facilitate a community-driven food donation environment where surplus household can donate to the one</w:t>
+      </w:r>
+      <w:r>
+        <w:rPr>
+          <w:rFonts w:ascii="Times New Roman" w:hAnsi="Times New Roman" w:cs="Times New Roman"/>
+          <w:sz w:val="24"/>
+          <w:szCs w:val="24"/>
+        </w:rPr>
+        <w:t>s</w:t>
+      </w:r>
+      <w:r>
+        <w:rPr>
+          <w:rFonts w:ascii="Times New Roman" w:hAnsi="Times New Roman" w:cs="Times New Roman"/>
+          <w:sz w:val="24"/>
+          <w:szCs w:val="24"/>
+        </w:rPr>
+        <w:t xml:space="preserve"> in need,</w:t>
+      </w:r>
+    </w:p>
+    <w:p>
+      <w:pPr>
+        <w:pStyle w:val="ListParagraph"/>
+        <w:numPr>
+          <w:ilvl w:val="0"/>
+          <w:numId w:val="9"/>
+        </w:numPr>
+        <w:spacing w:before="240" w:line="360" w:lineRule="auto"/>
+        <w:rPr>
+          <w:rFonts w:ascii="Times New Roman" w:hAnsi="Times New Roman" w:cs="Times New Roman"/>
+          <w:sz w:val="24"/>
+          <w:szCs w:val="24"/>
+        </w:rPr>
+      </w:pPr>
+      <w:r>
+        <w:rPr>
+          <w:rFonts w:ascii="Times New Roman" w:hAnsi="Times New Roman" w:cs="Times New Roman"/>
+          <w:sz w:val="24"/>
+          <w:szCs w:val="24"/>
+        </w:rPr>
+        <w:t>To facilitate the optimal utilization of every food item available through expiry date tracking and weekly meal planning</w:t>
+      </w:r>
+      <w:r>
+        <w:rPr>
+          <w:rFonts w:ascii="Times New Roman" w:hAnsi="Times New Roman" w:cs="Times New Roman"/>
+          <w:sz w:val="24"/>
+          <w:szCs w:val="24"/>
+        </w:rPr>
+        <w:t>,</w:t>
+      </w:r>
+    </w:p>
+    <w:p>
+      <w:pPr>
+        <w:pStyle w:val="ListParagraph"/>
+        <w:numPr>
+          <w:ilvl w:val="0"/>
+          <w:numId w:val="9"/>
+        </w:numPr>
+        <w:spacing w:before="240" w:line="360" w:lineRule="auto"/>
+        <w:rPr>
+          <w:rFonts w:ascii="Times New Roman" w:hAnsi="Times New Roman" w:cs="Times New Roman"/>
+          <w:sz w:val="24"/>
+          <w:szCs w:val="24"/>
+        </w:rPr>
+      </w:pPr>
+      <w:r>
+        <w:rPr>
+          <w:rFonts w:ascii="Times New Roman" w:hAnsi="Times New Roman" w:cs="Times New Roman"/>
+          <w:sz w:val="24"/>
+          <w:szCs w:val="24"/>
+        </w:rPr>
+        <w:t>To help user remember the inventory and supplies</w:t>
+      </w:r>
+      <w:r>
+        <w:rPr>
+          <w:rFonts w:ascii="Times New Roman" w:hAnsi="Times New Roman" w:cs="Times New Roman"/>
+          <w:sz w:val="24"/>
+          <w:szCs w:val="24"/>
+        </w:rPr>
+        <w:t xml:space="preserve"> by timely notifications</w:t>
+      </w:r>
+      <w:r>
+        <w:rPr>
+          <w:rFonts w:ascii="Times New Roman" w:hAnsi="Times New Roman" w:cs="Times New Roman"/>
+          <w:sz w:val="24"/>
+          <w:szCs w:val="24"/>
+        </w:rPr>
+        <w:t>, and result in less food waste.</w:t>
+      </w:r>
+      <w:r>
+        <w:rPr>
+          <w:rFonts w:ascii="Times New Roman" w:hAnsi="Times New Roman" w:cs="Times New Roman"/>
+          <w:sz w:val="24"/>
+          <w:szCs w:val="24"/>
+        </w:rPr>
+        <w:t xml:space="preserve"> </w:t>
+      </w:r>
+    </w:p>
+    <w:p>
+      <w:pPr>
+        <w:rPr>
+          <w:rFonts w:ascii="Times New Roman" w:hAnsi="Times New Roman" w:cs="Times New Roman"/>
+          <w:sz w:val="24"/>
+          <w:szCs w:val="24"/>
+        </w:rPr>
+      </w:pPr>
+      <w:r>
+        <w:rPr>
+          <w:rFonts w:ascii="Times New Roman" w:hAnsi="Times New Roman" w:cs="Times New Roman"/>
+          <w:sz w:val="24"/>
+          <w:szCs w:val="24"/>
+        </w:rPr>
+        <w:br w:type="page"/>
+      </w:r>
+    </w:p>
+    <w:p>
+      <w:pPr>
+        <w:pStyle w:val="Main-Heading"/>
+      </w:pPr>
+      <w:r>
+        <w:lastRenderedPageBreak/>
+        <w:t>Project Objectives</w:t>
+      </w:r>
+    </w:p>
+    <w:p>
+      <w:pPr>
+        <w:pStyle w:val="Normal0"/>
+      </w:pPr>
+      <w:r>
+        <w:t xml:space="preserve">Upon the completion of </w:t>
+      </w:r>
+      <w:proofErr w:type="spellStart"/>
+      <w:r>
+        <w:t>saveplate</w:t>
+      </w:r>
+      <w:proofErr w:type="spellEnd"/>
+      <w:r>
+        <w:t xml:space="preserve"> project, we </w:t>
+      </w:r>
+      <w:r>
+        <w:t xml:space="preserve">aim to </w:t>
+      </w:r>
+      <w:r>
+        <w:t>build a system which can reduce the food waste being produced and change the number of degrading conditions of food management to some sort better than what we began from. The following are the specific objectives we aim to achieve:</w:t>
+      </w:r>
+    </w:p>
+    <w:p>
+      <w:pPr>
+        <w:pStyle w:val="Normal0"/>
+        <w:numPr>
+          <w:ilvl w:val="0"/>
+          <w:numId w:val="11"/>
+        </w:numPr>
+        <w:spacing w:after="0" w:line="360" w:lineRule="auto"/>
+      </w:pPr>
+      <w:r>
+        <w:t>To design and implement a secure user registration</w:t>
+      </w:r>
+      <w:r>
+        <w:t xml:space="preserve"> and privacy setting with two-factor authentication (2FA),</w:t>
+      </w:r>
+    </w:p>
+    <w:p>
+      <w:pPr>
+        <w:pStyle w:val="Normal0"/>
+        <w:numPr>
+          <w:ilvl w:val="0"/>
+          <w:numId w:val="11"/>
+        </w:numPr>
+        <w:spacing w:after="0" w:line="360" w:lineRule="auto"/>
+      </w:pPr>
+      <w:r>
+        <w:t xml:space="preserve">To build a functional food inventory management system, allowing use to </w:t>
+      </w:r>
+      <w:proofErr w:type="spellStart"/>
+      <w:proofErr w:type="gramStart"/>
+      <w:r>
+        <w:t>add,update</w:t>
+      </w:r>
+      <w:proofErr w:type="spellEnd"/>
+      <w:proofErr w:type="gramEnd"/>
+      <w:r>
+        <w:t xml:space="preserve"> (edit), categorize, and delete food items,</w:t>
+      </w:r>
+    </w:p>
+    <w:p>
+      <w:pPr>
+        <w:pStyle w:val="ListParagraph"/>
+        <w:numPr>
+          <w:ilvl w:val="0"/>
+          <w:numId w:val="11"/>
+        </w:numPr>
+        <w:spacing w:after="0" w:line="360" w:lineRule="auto"/>
+      </w:pPr>
+      <w:r>
+        <w:t>To build a functional expiry date tracking system,</w:t>
+      </w:r>
+    </w:p>
+    <w:p>
+      <w:pPr>
+        <w:pStyle w:val="ListParagraph"/>
+        <w:numPr>
+          <w:ilvl w:val="0"/>
+          <w:numId w:val="11"/>
+        </w:numPr>
+        <w:spacing w:after="0" w:line="360" w:lineRule="auto"/>
+      </w:pPr>
+      <w:r>
+        <w:t>To implement a food donation features, to list users the surplus item in their inventory, browse through available donation made, and claim items.  A fully functional donation flow.</w:t>
+      </w:r>
+    </w:p>
+    <w:p>
+      <w:pPr>
+        <w:pStyle w:val="ListParagraph"/>
+        <w:numPr>
+          <w:ilvl w:val="0"/>
+          <w:numId w:val="11"/>
+        </w:numPr>
+        <w:spacing w:after="0" w:line="360" w:lineRule="auto"/>
+      </w:pPr>
+      <w:r>
+        <w:t xml:space="preserve">To build </w:t>
+      </w:r>
+      <w:proofErr w:type="gramStart"/>
+      <w:r>
+        <w:t>an</w:t>
+      </w:r>
+      <w:proofErr w:type="gramEnd"/>
+      <w:r>
+        <w:t xml:space="preserve"> real-time notification features that alerts users days prior to the food expiry date of the stored items,</w:t>
+      </w:r>
+      <w:r>
+        <w:t xml:space="preserve"> notify </w:t>
+      </w:r>
+      <w:r>
+        <w:t>when a donation is made,</w:t>
+      </w:r>
+    </w:p>
+    <w:p>
+      <w:pPr>
+        <w:pStyle w:val="ListParagraph"/>
+        <w:numPr>
+          <w:ilvl w:val="0"/>
+          <w:numId w:val="11"/>
+        </w:numPr>
+        <w:spacing w:after="0" w:line="360" w:lineRule="auto"/>
+      </w:pPr>
+      <w:r>
+        <w:t>To provide visual</w:t>
+      </w:r>
+    </w:p>
+    <w:p>
+      <w:pPr>
+        <w:pStyle w:val="ListParagraph"/>
+      </w:pPr>
+    </w:p>
+    <w:p>
+      <w:pPr>
+        <w:pStyle w:val="ListParagraph"/>
+        <w:numPr>
+          <w:ilvl w:val="0"/>
+          <w:numId w:val="7"/>
+        </w:numPr>
+        <w:spacing w:before="240" w:line="360" w:lineRule="auto"/>
         <w:jc w:val="both"/>
         <w:rPr>
           <w:rFonts w:ascii="Times New Roman" w:hAnsi="Times New Roman" w:cs="Times New Roman"/>
@@ -541,8 +1389,7 @@
           <w:sz w:val="24"/>
           <w:szCs w:val="24"/>
         </w:rPr>
-        <w:lastRenderedPageBreak/>
-        <w:t>Project Aims</w:t>
+        <w:t>Project Objectives</w:t>
       </w:r>
     </w:p>
     <w:p>
@@ -552,7 +1399,7 @@
           <w:ilvl w:val="1"/>
           <w:numId w:val="7"/>
         </w:numPr>
-        <w:spacing w:line="360" w:lineRule="auto"/>
+        <w:spacing w:before="240" w:line="360" w:lineRule="auto"/>
         <w:jc w:val="both"/>
         <w:rPr>
           <w:rFonts w:ascii="Times New Roman" w:hAnsi="Times New Roman" w:cs="Times New Roman"/>
@@ -566,7 +1413,7 @@
           <w:sz w:val="24"/>
           <w:szCs w:val="24"/>
         </w:rPr>
-        <w:t>To develop a smart food waste management system</w:t>
+        <w:t>To design a functional food inventory system within the first 2 weeks</w:t>
       </w:r>
     </w:p>
     <w:p>
@@ -576,7 +1423,7 @@
           <w:ilvl w:val="1"/>
           <w:numId w:val="7"/>
         </w:numPr>
-        <w:spacing w:line="360" w:lineRule="auto"/>
+        <w:spacing w:before="240" w:line="360" w:lineRule="auto"/>
         <w:jc w:val="both"/>
         <w:rPr>
           <w:rFonts w:ascii="Times New Roman" w:hAnsi="Times New Roman" w:cs="Times New Roman"/>
@@ -590,7 +1437,7 @@
           <w:sz w:val="24"/>
           <w:szCs w:val="24"/>
         </w:rPr>
-        <w:t>To promote sustainable consumption practices</w:t>
+        <w:t>To implement notification alerts for expiry tracking</w:t>
       </w:r>
     </w:p>
     <w:p>
@@ -600,7 +1447,7 @@
           <w:ilvl w:val="1"/>
           <w:numId w:val="7"/>
         </w:numPr>
-        <w:spacing w:line="360" w:lineRule="auto"/>
+        <w:spacing w:before="240" w:line="360" w:lineRule="auto"/>
         <w:jc w:val="both"/>
         <w:rPr>
           <w:rFonts w:ascii="Times New Roman" w:hAnsi="Times New Roman" w:cs="Times New Roman"/>
@@ -614,14 +1461,17 @@
           <w:sz w:val="24"/>
           <w:szCs w:val="24"/>
         </w:rPr>
-        <w:t>To provide real-time tracking of food inventory</w:t>
+        <w:t>To develop a meal planning module for users (households, donors, and individuals)</w:t>
       </w:r>
     </w:p>
     <w:p>
       <w:pPr>
         <w:pStyle w:val="ListParagraph"/>
-        <w:spacing w:line="360" w:lineRule="auto"/>
-        <w:ind w:left="1440"/>
+        <w:numPr>
+          <w:ilvl w:val="1"/>
+          <w:numId w:val="7"/>
+        </w:numPr>
+        <w:spacing w:before="240" w:line="360" w:lineRule="auto"/>
         <w:jc w:val="both"/>
         <w:rPr>
           <w:rFonts w:ascii="Times New Roman" w:hAnsi="Times New Roman" w:cs="Times New Roman"/>
@@ -629,6 +1479,32 @@
           <w:szCs w:val="24"/>
         </w:rPr>
       </w:pPr>
+      <w:r>
+        <w:rPr>
+          <w:rFonts w:ascii="Times New Roman" w:hAnsi="Times New Roman" w:cs="Times New Roman"/>
+          <w:sz w:val="24"/>
+          <w:szCs w:val="24"/>
+        </w:rPr>
+        <w:t>To ensure the system usability and performance</w:t>
+      </w:r>
+    </w:p>
+    <w:p>
+      <w:pPr>
+        <w:spacing w:before="240" w:line="360" w:lineRule="auto"/>
+        <w:rPr>
+          <w:rFonts w:ascii="Times New Roman" w:hAnsi="Times New Roman" w:cs="Times New Roman"/>
+          <w:sz w:val="24"/>
+          <w:szCs w:val="24"/>
+        </w:rPr>
+      </w:pPr>
+      <w:r>
+        <w:rPr>
+          <w:rFonts w:ascii="Times New Roman" w:hAnsi="Times New Roman" w:cs="Times New Roman"/>
+          <w:sz w:val="24"/>
+          <w:szCs w:val="24"/>
+        </w:rPr>
+        <w:br w:type="page"/>
+      </w:r>
     </w:p>
     <w:p>
       <w:pPr>
@@ -637,7 +1513,7 @@
           <w:ilvl w:val="0"/>
           <w:numId w:val="7"/>
         </w:numPr>
-        <w:spacing w:line="360" w:lineRule="auto"/>
+        <w:spacing w:before="240" w:line="360" w:lineRule="auto"/>
         <w:jc w:val="both"/>
         <w:rPr>
           <w:rFonts w:ascii="Times New Roman" w:hAnsi="Times New Roman" w:cs="Times New Roman"/>
@@ -655,7 +1531,8 @@
           <w:sz w:val="24"/>
           <w:szCs w:val="24"/>
         </w:rPr>
-        <w:t>Project Objectives</w:t>
+        <w:lastRenderedPageBreak/>
+        <w:t>Project Scope</w:t>
       </w:r>
     </w:p>
     <w:p>
@@ -665,7 +1542,7 @@
           <w:ilvl w:val="1"/>
           <w:numId w:val="7"/>
         </w:numPr>
-        <w:spacing w:line="360" w:lineRule="auto"/>
+        <w:spacing w:before="240" w:line="360" w:lineRule="auto"/>
         <w:jc w:val="both"/>
         <w:rPr>
           <w:rFonts w:ascii="Times New Roman" w:hAnsi="Times New Roman" w:cs="Times New Roman"/>
@@ -676,10 +1553,116 @@
       <w:r>
         <w:rPr>
           <w:rFonts w:ascii="Times New Roman" w:hAnsi="Times New Roman" w:cs="Times New Roman"/>
-          <w:sz w:val="24"/>
-          <w:szCs w:val="24"/>
-        </w:rPr>
-        <w:t>To design a functional food inventory system within the first 2 weeks</w:t>
+          <w:b/>
+          <w:bCs/>
+          <w:sz w:val="24"/>
+          <w:szCs w:val="24"/>
+        </w:rPr>
+        <w:t>In Scope</w:t>
+      </w:r>
+      <w:r>
+        <w:rPr>
+          <w:rFonts w:ascii="Times New Roman" w:hAnsi="Times New Roman" w:cs="Times New Roman"/>
+          <w:sz w:val="24"/>
+          <w:szCs w:val="24"/>
+        </w:rPr>
+        <w:t>:</w:t>
+      </w:r>
+    </w:p>
+    <w:p>
+      <w:pPr>
+        <w:pStyle w:val="ListParagraph"/>
+        <w:numPr>
+          <w:ilvl w:val="2"/>
+          <w:numId w:val="7"/>
+        </w:numPr>
+        <w:spacing w:before="240" w:line="360" w:lineRule="auto"/>
+        <w:jc w:val="both"/>
+        <w:rPr>
+          <w:rFonts w:ascii="Times New Roman" w:hAnsi="Times New Roman" w:cs="Times New Roman"/>
+          <w:sz w:val="24"/>
+          <w:szCs w:val="24"/>
+        </w:rPr>
+      </w:pPr>
+      <w:r>
+        <w:rPr>
+          <w:rFonts w:ascii="Times New Roman" w:hAnsi="Times New Roman" w:cs="Times New Roman"/>
+          <w:sz w:val="24"/>
+          <w:szCs w:val="24"/>
+        </w:rPr>
+        <w:t>User Registration and Login</w:t>
+      </w:r>
+    </w:p>
+    <w:p>
+      <w:pPr>
+        <w:pStyle w:val="ListParagraph"/>
+        <w:numPr>
+          <w:ilvl w:val="2"/>
+          <w:numId w:val="7"/>
+        </w:numPr>
+        <w:spacing w:before="240" w:line="360" w:lineRule="auto"/>
+        <w:jc w:val="both"/>
+        <w:rPr>
+          <w:rFonts w:ascii="Times New Roman" w:hAnsi="Times New Roman" w:cs="Times New Roman"/>
+          <w:sz w:val="24"/>
+          <w:szCs w:val="24"/>
+        </w:rPr>
+      </w:pPr>
+      <w:r>
+        <w:rPr>
+          <w:rFonts w:ascii="Times New Roman" w:hAnsi="Times New Roman" w:cs="Times New Roman"/>
+          <w:sz w:val="24"/>
+          <w:szCs w:val="24"/>
+        </w:rPr>
+        <w:t>Food Inventory Management</w:t>
+      </w:r>
+    </w:p>
+    <w:p>
+      <w:pPr>
+        <w:pStyle w:val="ListParagraph"/>
+        <w:numPr>
+          <w:ilvl w:val="2"/>
+          <w:numId w:val="7"/>
+        </w:numPr>
+        <w:spacing w:before="240" w:line="360" w:lineRule="auto"/>
+        <w:jc w:val="both"/>
+        <w:rPr>
+          <w:rFonts w:ascii="Times New Roman" w:hAnsi="Times New Roman" w:cs="Times New Roman"/>
+          <w:sz w:val="24"/>
+          <w:szCs w:val="24"/>
+        </w:rPr>
+      </w:pPr>
+      <w:r>
+        <w:rPr>
+          <w:rFonts w:ascii="Times New Roman" w:hAnsi="Times New Roman" w:cs="Times New Roman"/>
+          <w:sz w:val="24"/>
+          <w:szCs w:val="24"/>
+        </w:rPr>
+        <w:t>Expiry Notifications</w:t>
+      </w:r>
+    </w:p>
+    <w:p>
+      <w:pPr>
+        <w:pStyle w:val="ListParagraph"/>
+        <w:numPr>
+          <w:ilvl w:val="2"/>
+          <w:numId w:val="7"/>
+        </w:numPr>
+        <w:spacing w:before="240" w:line="360" w:lineRule="auto"/>
+        <w:jc w:val="both"/>
+        <w:rPr>
+          <w:rFonts w:ascii="Times New Roman" w:hAnsi="Times New Roman" w:cs="Times New Roman"/>
+          <w:sz w:val="24"/>
+          <w:szCs w:val="24"/>
+        </w:rPr>
+      </w:pPr>
+      <w:r>
+        <w:rPr>
+          <w:rFonts w:ascii="Times New Roman" w:hAnsi="Times New Roman" w:cs="Times New Roman"/>
+          <w:sz w:val="24"/>
+          <w:szCs w:val="24"/>
+        </w:rPr>
+        <w:t>Meal Planning System</w:t>
       </w:r>
     </w:p>
     <w:p>
@@ -689,7 +1672,7 @@
           <w:ilvl w:val="1"/>
           <w:numId w:val="7"/>
         </w:numPr>
-        <w:spacing w:line="360" w:lineRule="auto"/>
+        <w:spacing w:before="240" w:line="360" w:lineRule="auto"/>
         <w:jc w:val="both"/>
         <w:rPr>
           <w:rFonts w:ascii="Times New Roman" w:hAnsi="Times New Roman" w:cs="Times New Roman"/>
@@ -700,10 +1683,147 @@
       <w:r>
         <w:rPr>
           <w:rFonts w:ascii="Times New Roman" w:hAnsi="Times New Roman" w:cs="Times New Roman"/>
-          <w:sz w:val="24"/>
-          <w:szCs w:val="24"/>
-        </w:rPr>
-        <w:t>To implement notification alerts for expiry tracking</w:t>
+          <w:b/>
+          <w:bCs/>
+          <w:sz w:val="24"/>
+          <w:szCs w:val="24"/>
+        </w:rPr>
+        <w:t>Out of</w:t>
+      </w:r>
+      <w:r>
+        <w:rPr>
+          <w:rFonts w:ascii="Times New Roman" w:hAnsi="Times New Roman" w:cs="Times New Roman"/>
+          <w:sz w:val="24"/>
+          <w:szCs w:val="24"/>
+        </w:rPr>
+        <w:t xml:space="preserve"> </w:t>
+      </w:r>
+      <w:r>
+        <w:rPr>
+          <w:rFonts w:ascii="Times New Roman" w:hAnsi="Times New Roman" w:cs="Times New Roman"/>
+          <w:b/>
+          <w:bCs/>
+          <w:sz w:val="24"/>
+          <w:szCs w:val="24"/>
+        </w:rPr>
+        <w:t>Scope</w:t>
+      </w:r>
+    </w:p>
+    <w:p>
+      <w:pPr>
+        <w:pStyle w:val="ListParagraph"/>
+        <w:numPr>
+          <w:ilvl w:val="2"/>
+          <w:numId w:val="7"/>
+        </w:numPr>
+        <w:spacing w:before="240" w:line="360" w:lineRule="auto"/>
+        <w:jc w:val="both"/>
+        <w:rPr>
+          <w:rFonts w:ascii="Times New Roman" w:hAnsi="Times New Roman" w:cs="Times New Roman"/>
+          <w:sz w:val="24"/>
+          <w:szCs w:val="24"/>
+        </w:rPr>
+      </w:pPr>
+      <w:r>
+        <w:rPr>
+          <w:rFonts w:ascii="Times New Roman" w:hAnsi="Times New Roman" w:cs="Times New Roman"/>
+          <w:sz w:val="24"/>
+          <w:szCs w:val="24"/>
+        </w:rPr>
+        <w:t>Online Payment System</w:t>
+      </w:r>
+    </w:p>
+    <w:p>
+      <w:pPr>
+        <w:pStyle w:val="ListParagraph"/>
+        <w:numPr>
+          <w:ilvl w:val="2"/>
+          <w:numId w:val="7"/>
+        </w:numPr>
+        <w:spacing w:before="240" w:line="360" w:lineRule="auto"/>
+        <w:jc w:val="both"/>
+        <w:rPr>
+          <w:rFonts w:ascii="Times New Roman" w:hAnsi="Times New Roman" w:cs="Times New Roman"/>
+          <w:sz w:val="24"/>
+          <w:szCs w:val="24"/>
+        </w:rPr>
+      </w:pPr>
+      <w:r>
+        <w:rPr>
+          <w:rFonts w:ascii="Times New Roman" w:hAnsi="Times New Roman" w:cs="Times New Roman"/>
+          <w:sz w:val="24"/>
+          <w:szCs w:val="24"/>
+        </w:rPr>
+        <w:t>Third-party delivery services</w:t>
+      </w:r>
+    </w:p>
+    <w:p>
+      <w:pPr>
+        <w:pStyle w:val="ListParagraph"/>
+        <w:spacing w:before="240" w:line="360" w:lineRule="auto"/>
+        <w:ind w:left="2160"/>
+        <w:jc w:val="both"/>
+        <w:rPr>
+          <w:rFonts w:ascii="Times New Roman" w:hAnsi="Times New Roman" w:cs="Times New Roman"/>
+          <w:sz w:val="24"/>
+          <w:szCs w:val="24"/>
+        </w:rPr>
+      </w:pPr>
+    </w:p>
+    <w:p>
+      <w:pPr>
+        <w:pStyle w:val="ListParagraph"/>
+        <w:numPr>
+          <w:ilvl w:val="0"/>
+          <w:numId w:val="7"/>
+        </w:numPr>
+        <w:spacing w:before="240" w:line="360" w:lineRule="auto"/>
+        <w:jc w:val="both"/>
+        <w:rPr>
+          <w:rFonts w:ascii="Times New Roman" w:hAnsi="Times New Roman" w:cs="Times New Roman"/>
+          <w:b/>
+          <w:bCs/>
+          <w:sz w:val="24"/>
+          <w:szCs w:val="24"/>
+        </w:rPr>
+      </w:pPr>
+      <w:r>
+        <w:rPr>
+          <w:rFonts w:ascii="Times New Roman" w:hAnsi="Times New Roman" w:cs="Times New Roman"/>
+          <w:b/>
+          <w:bCs/>
+          <w:sz w:val="24"/>
+          <w:szCs w:val="24"/>
+        </w:rPr>
+        <w:t>Project Schedule</w:t>
+      </w:r>
+    </w:p>
+    <w:p>
+      <w:pPr>
+        <w:spacing w:before="240" w:line="360" w:lineRule="auto"/>
+        <w:ind w:left="720"/>
+        <w:jc w:val="both"/>
+        <w:rPr>
+          <w:rFonts w:ascii="Times New Roman" w:hAnsi="Times New Roman" w:cs="Times New Roman"/>
+          <w:sz w:val="24"/>
+          <w:szCs w:val="24"/>
+        </w:rPr>
+      </w:pPr>
+      <w:r>
+        <w:rPr>
+          <w:rFonts w:ascii="Times New Roman" w:hAnsi="Times New Roman" w:cs="Times New Roman"/>
+          <w:sz w:val="24"/>
+          <w:szCs w:val="24"/>
+        </w:rPr>
+        <w:t>The project follows an iterative and incremental methodology.</w:t>
+      </w:r>
+      <w:r>
+        <w:rPr>
+          <w:rFonts w:ascii="Times New Roman" w:hAnsi="Times New Roman" w:cs="Times New Roman"/>
+          <w:sz w:val="24"/>
+          <w:szCs w:val="24"/>
+        </w:rPr>
+        <w:t xml:space="preserve"> It includes: </w:t>
       </w:r>
     </w:p>
     <w:p>
@@ -713,7 +1833,7 @@
           <w:ilvl w:val="1"/>
           <w:numId w:val="7"/>
         </w:numPr>
-        <w:spacing w:line="360" w:lineRule="auto"/>
+        <w:spacing w:before="240" w:line="360" w:lineRule="auto"/>
         <w:jc w:val="both"/>
         <w:rPr>
           <w:rFonts w:ascii="Times New Roman" w:hAnsi="Times New Roman" w:cs="Times New Roman"/>
@@ -727,7 +1847,7 @@
           <w:sz w:val="24"/>
           <w:szCs w:val="24"/>
         </w:rPr>
-        <w:t>To develop a meal planning module for users (households, donors, and individuals)</w:t>
+        <w:t>Work Breakdown Structure (WBS)</w:t>
       </w:r>
     </w:p>
     <w:p>
@@ -737,7 +1857,7 @@
           <w:ilvl w:val="1"/>
           <w:numId w:val="7"/>
         </w:numPr>
-        <w:spacing w:line="360" w:lineRule="auto"/>
+        <w:spacing w:before="240" w:line="360" w:lineRule="auto"/>
         <w:jc w:val="both"/>
         <w:rPr>
           <w:rFonts w:ascii="Times New Roman" w:hAnsi="Times New Roman" w:cs="Times New Roman"/>
@@ -751,25 +1871,45 @@
           <w:sz w:val="24"/>
           <w:szCs w:val="24"/>
         </w:rPr>
-        <w:t>To ensure the system usability and performance</w:t>
-      </w:r>
-    </w:p>
-    <w:p>
-      <w:pPr>
-        <w:rPr>
-          <w:rFonts w:ascii="Times New Roman" w:hAnsi="Times New Roman" w:cs="Times New Roman"/>
-          <w:sz w:val="24"/>
-          <w:szCs w:val="24"/>
-        </w:rPr>
-      </w:pPr>
-      <w:r>
-        <w:rPr>
-          <w:rFonts w:ascii="Times New Roman" w:hAnsi="Times New Roman" w:cs="Times New Roman"/>
-          <w:sz w:val="24"/>
-          <w:szCs w:val="24"/>
-        </w:rPr>
-        <w:br w:type="page"/>
-      </w:r>
+        <w:t>Gantt Chart</w:t>
+      </w:r>
+    </w:p>
+    <w:p>
+      <w:pPr>
+        <w:pStyle w:val="ListParagraph"/>
+        <w:numPr>
+          <w:ilvl w:val="1"/>
+          <w:numId w:val="7"/>
+        </w:numPr>
+        <w:spacing w:before="240" w:line="360" w:lineRule="auto"/>
+        <w:jc w:val="both"/>
+        <w:rPr>
+          <w:rFonts w:ascii="Times New Roman" w:hAnsi="Times New Roman" w:cs="Times New Roman"/>
+          <w:sz w:val="24"/>
+          <w:szCs w:val="24"/>
+        </w:rPr>
+      </w:pPr>
+      <w:r>
+        <w:rPr>
+          <w:rFonts w:ascii="Times New Roman" w:hAnsi="Times New Roman" w:cs="Times New Roman"/>
+          <w:sz w:val="24"/>
+          <w:szCs w:val="24"/>
+        </w:rPr>
+        <w:t>Milestones</w:t>
+      </w:r>
+    </w:p>
+    <w:p>
+      <w:pPr>
+        <w:pStyle w:val="ListParagraph"/>
+        <w:spacing w:before="240" w:line="360" w:lineRule="auto"/>
+        <w:ind w:left="1440"/>
+        <w:jc w:val="both"/>
+        <w:rPr>
+          <w:rFonts w:ascii="Times New Roman" w:hAnsi="Times New Roman" w:cs="Times New Roman"/>
+          <w:sz w:val="24"/>
+          <w:szCs w:val="24"/>
+        </w:rPr>
+      </w:pPr>
     </w:p>
     <w:p>
       <w:pPr>
@@ -778,7 +1918,7 @@
           <w:ilvl w:val="0"/>
           <w:numId w:val="7"/>
         </w:numPr>
-        <w:spacing w:line="360" w:lineRule="auto"/>
+        <w:spacing w:before="240" w:line="360" w:lineRule="auto"/>
         <w:jc w:val="both"/>
         <w:rPr>
           <w:rFonts w:ascii="Times New Roman" w:hAnsi="Times New Roman" w:cs="Times New Roman"/>
@@ -796,8 +1936,7 @@
           <w:sz w:val="24"/>
           <w:szCs w:val="24"/>
         </w:rPr>
-        <w:lastRenderedPageBreak/>
-        <w:t>Project Scope</w:t>
+        <w:t>Technical Description</w:t>
       </w:r>
     </w:p>
     <w:p>
@@ -807,411 +1946,7 @@
           <w:ilvl w:val="1"/>
           <w:numId w:val="7"/>
         </w:numPr>
-        <w:spacing w:line="360" w:lineRule="auto"/>
-        <w:jc w:val="both"/>
-        <w:rPr>
-          <w:rFonts w:ascii="Times New Roman" w:hAnsi="Times New Roman" w:cs="Times New Roman"/>
-          <w:sz w:val="24"/>
-          <w:szCs w:val="24"/>
-        </w:rPr>
-      </w:pPr>
-      <w:r>
-        <w:rPr>
-          <w:rFonts w:ascii="Times New Roman" w:hAnsi="Times New Roman" w:cs="Times New Roman"/>
-          <w:b/>
-          <w:bCs/>
-          <w:sz w:val="24"/>
-          <w:szCs w:val="24"/>
-        </w:rPr>
-        <w:t>In Scope</w:t>
-      </w:r>
-      <w:r>
-        <w:rPr>
-          <w:rFonts w:ascii="Times New Roman" w:hAnsi="Times New Roman" w:cs="Times New Roman"/>
-          <w:sz w:val="24"/>
-          <w:szCs w:val="24"/>
-        </w:rPr>
-        <w:t>:</w:t>
-      </w:r>
-    </w:p>
-    <w:p>
-      <w:pPr>
-        <w:pStyle w:val="ListParagraph"/>
-        <w:numPr>
-          <w:ilvl w:val="2"/>
-          <w:numId w:val="7"/>
-        </w:numPr>
-        <w:spacing w:line="360" w:lineRule="auto"/>
-        <w:jc w:val="both"/>
-        <w:rPr>
-          <w:rFonts w:ascii="Times New Roman" w:hAnsi="Times New Roman" w:cs="Times New Roman"/>
-          <w:sz w:val="24"/>
-          <w:szCs w:val="24"/>
-        </w:rPr>
-      </w:pPr>
-      <w:r>
-        <w:rPr>
-          <w:rFonts w:ascii="Times New Roman" w:hAnsi="Times New Roman" w:cs="Times New Roman"/>
-          <w:sz w:val="24"/>
-          <w:szCs w:val="24"/>
-        </w:rPr>
-        <w:t>User Registration and Login</w:t>
-      </w:r>
-    </w:p>
-    <w:p>
-      <w:pPr>
-        <w:pStyle w:val="ListParagraph"/>
-        <w:numPr>
-          <w:ilvl w:val="2"/>
-          <w:numId w:val="7"/>
-        </w:numPr>
-        <w:spacing w:line="360" w:lineRule="auto"/>
-        <w:jc w:val="both"/>
-        <w:rPr>
-          <w:rFonts w:ascii="Times New Roman" w:hAnsi="Times New Roman" w:cs="Times New Roman"/>
-          <w:sz w:val="24"/>
-          <w:szCs w:val="24"/>
-        </w:rPr>
-      </w:pPr>
-      <w:r>
-        <w:rPr>
-          <w:rFonts w:ascii="Times New Roman" w:hAnsi="Times New Roman" w:cs="Times New Roman"/>
-          <w:sz w:val="24"/>
-          <w:szCs w:val="24"/>
-        </w:rPr>
-        <w:t>Food Inventory Management</w:t>
-      </w:r>
-    </w:p>
-    <w:p>
-      <w:pPr>
-        <w:pStyle w:val="ListParagraph"/>
-        <w:numPr>
-          <w:ilvl w:val="2"/>
-          <w:numId w:val="7"/>
-        </w:numPr>
-        <w:spacing w:line="360" w:lineRule="auto"/>
-        <w:jc w:val="both"/>
-        <w:rPr>
-          <w:rFonts w:ascii="Times New Roman" w:hAnsi="Times New Roman" w:cs="Times New Roman"/>
-          <w:sz w:val="24"/>
-          <w:szCs w:val="24"/>
-        </w:rPr>
-      </w:pPr>
-      <w:r>
-        <w:rPr>
-          <w:rFonts w:ascii="Times New Roman" w:hAnsi="Times New Roman" w:cs="Times New Roman"/>
-          <w:sz w:val="24"/>
-          <w:szCs w:val="24"/>
-        </w:rPr>
-        <w:t>Expiry Notifications</w:t>
-      </w:r>
-    </w:p>
-    <w:p>
-      <w:pPr>
-        <w:pStyle w:val="ListParagraph"/>
-        <w:numPr>
-          <w:ilvl w:val="2"/>
-          <w:numId w:val="7"/>
-        </w:numPr>
-        <w:spacing w:line="360" w:lineRule="auto"/>
-        <w:jc w:val="both"/>
-        <w:rPr>
-          <w:rFonts w:ascii="Times New Roman" w:hAnsi="Times New Roman" w:cs="Times New Roman"/>
-          <w:sz w:val="24"/>
-          <w:szCs w:val="24"/>
-        </w:rPr>
-      </w:pPr>
-      <w:r>
-        <w:rPr>
-          <w:rFonts w:ascii="Times New Roman" w:hAnsi="Times New Roman" w:cs="Times New Roman"/>
-          <w:sz w:val="24"/>
-          <w:szCs w:val="24"/>
-        </w:rPr>
-        <w:t>Meal Planning System</w:t>
-      </w:r>
-    </w:p>
-    <w:p>
-      <w:pPr>
-        <w:pStyle w:val="ListParagraph"/>
-        <w:numPr>
-          <w:ilvl w:val="1"/>
-          <w:numId w:val="7"/>
-        </w:numPr>
-        <w:spacing w:line="360" w:lineRule="auto"/>
-        <w:jc w:val="both"/>
-        <w:rPr>
-          <w:rFonts w:ascii="Times New Roman" w:hAnsi="Times New Roman" w:cs="Times New Roman"/>
-          <w:sz w:val="24"/>
-          <w:szCs w:val="24"/>
-        </w:rPr>
-      </w:pPr>
-      <w:r>
-        <w:rPr>
-          <w:rFonts w:ascii="Times New Roman" w:hAnsi="Times New Roman" w:cs="Times New Roman"/>
-          <w:b/>
-          <w:bCs/>
-          <w:sz w:val="24"/>
-          <w:szCs w:val="24"/>
-        </w:rPr>
-        <w:t>Out of</w:t>
-      </w:r>
-      <w:r>
-        <w:rPr>
-          <w:rFonts w:ascii="Times New Roman" w:hAnsi="Times New Roman" w:cs="Times New Roman"/>
-          <w:sz w:val="24"/>
-          <w:szCs w:val="24"/>
-        </w:rPr>
-        <w:t xml:space="preserve"> </w:t>
-      </w:r>
-      <w:r>
-        <w:rPr>
-          <w:rFonts w:ascii="Times New Roman" w:hAnsi="Times New Roman" w:cs="Times New Roman"/>
-          <w:b/>
-          <w:bCs/>
-          <w:sz w:val="24"/>
-          <w:szCs w:val="24"/>
-        </w:rPr>
-        <w:t>Scope</w:t>
-      </w:r>
-    </w:p>
-    <w:p>
-      <w:pPr>
-        <w:pStyle w:val="ListParagraph"/>
-        <w:numPr>
-          <w:ilvl w:val="2"/>
-          <w:numId w:val="7"/>
-        </w:numPr>
-        <w:spacing w:line="360" w:lineRule="auto"/>
-        <w:jc w:val="both"/>
-        <w:rPr>
-          <w:rFonts w:ascii="Times New Roman" w:hAnsi="Times New Roman" w:cs="Times New Roman"/>
-          <w:sz w:val="24"/>
-          <w:szCs w:val="24"/>
-        </w:rPr>
-      </w:pPr>
-      <w:r>
-        <w:rPr>
-          <w:rFonts w:ascii="Times New Roman" w:hAnsi="Times New Roman" w:cs="Times New Roman"/>
-          <w:sz w:val="24"/>
-          <w:szCs w:val="24"/>
-        </w:rPr>
-        <w:t>Online Payment System</w:t>
-      </w:r>
-    </w:p>
-    <w:p>
-      <w:pPr>
-        <w:pStyle w:val="ListParagraph"/>
-        <w:numPr>
-          <w:ilvl w:val="2"/>
-          <w:numId w:val="7"/>
-        </w:numPr>
-        <w:spacing w:line="360" w:lineRule="auto"/>
-        <w:jc w:val="both"/>
-        <w:rPr>
-          <w:rFonts w:ascii="Times New Roman" w:hAnsi="Times New Roman" w:cs="Times New Roman"/>
-          <w:sz w:val="24"/>
-          <w:szCs w:val="24"/>
-        </w:rPr>
-      </w:pPr>
-      <w:r>
-        <w:rPr>
-          <w:rFonts w:ascii="Times New Roman" w:hAnsi="Times New Roman" w:cs="Times New Roman"/>
-          <w:sz w:val="24"/>
-          <w:szCs w:val="24"/>
-        </w:rPr>
-        <w:t>Third-party delivery services</w:t>
-      </w:r>
-    </w:p>
-    <w:p>
-      <w:pPr>
-        <w:pStyle w:val="ListParagraph"/>
-        <w:spacing w:line="360" w:lineRule="auto"/>
-        <w:ind w:left="2160"/>
-        <w:jc w:val="both"/>
-        <w:rPr>
-          <w:rFonts w:ascii="Times New Roman" w:hAnsi="Times New Roman" w:cs="Times New Roman"/>
-          <w:sz w:val="24"/>
-          <w:szCs w:val="24"/>
-        </w:rPr>
-      </w:pPr>
-    </w:p>
-    <w:p>
-      <w:pPr>
-        <w:pStyle w:val="ListParagraph"/>
-        <w:numPr>
-          <w:ilvl w:val="0"/>
-          <w:numId w:val="7"/>
-        </w:numPr>
-        <w:spacing w:line="360" w:lineRule="auto"/>
-        <w:jc w:val="both"/>
-        <w:rPr>
-          <w:rFonts w:ascii="Times New Roman" w:hAnsi="Times New Roman" w:cs="Times New Roman"/>
-          <w:b/>
-          <w:bCs/>
-          <w:sz w:val="24"/>
-          <w:szCs w:val="24"/>
-        </w:rPr>
-      </w:pPr>
-      <w:r>
-        <w:rPr>
-          <w:rFonts w:ascii="Times New Roman" w:hAnsi="Times New Roman" w:cs="Times New Roman"/>
-          <w:b/>
-          <w:bCs/>
-          <w:sz w:val="24"/>
-          <w:szCs w:val="24"/>
-        </w:rPr>
-        <w:t>Project Schedule</w:t>
-      </w:r>
-    </w:p>
-    <w:p>
-      <w:pPr>
-        <w:spacing w:line="360" w:lineRule="auto"/>
-        <w:ind w:left="720"/>
-        <w:jc w:val="both"/>
-        <w:rPr>
-          <w:rFonts w:ascii="Times New Roman" w:hAnsi="Times New Roman" w:cs="Times New Roman"/>
-          <w:sz w:val="24"/>
-          <w:szCs w:val="24"/>
-        </w:rPr>
-      </w:pPr>
-      <w:r>
-        <w:rPr>
-          <w:rFonts w:ascii="Times New Roman" w:hAnsi="Times New Roman" w:cs="Times New Roman"/>
-          <w:sz w:val="24"/>
-          <w:szCs w:val="24"/>
-        </w:rPr>
-        <w:t>The project follows an iterative and incremental methodology.</w:t>
-      </w:r>
-      <w:r>
-        <w:rPr>
-          <w:rFonts w:ascii="Times New Roman" w:hAnsi="Times New Roman" w:cs="Times New Roman"/>
-          <w:sz w:val="24"/>
-          <w:szCs w:val="24"/>
-        </w:rPr>
-        <w:t xml:space="preserve"> It includes: </w:t>
-      </w:r>
-    </w:p>
-    <w:p>
-      <w:pPr>
-        <w:pStyle w:val="ListParagraph"/>
-        <w:numPr>
-          <w:ilvl w:val="1"/>
-          <w:numId w:val="7"/>
-        </w:numPr>
-        <w:spacing w:line="360" w:lineRule="auto"/>
-        <w:jc w:val="both"/>
-        <w:rPr>
-          <w:rFonts w:ascii="Times New Roman" w:hAnsi="Times New Roman" w:cs="Times New Roman"/>
-          <w:sz w:val="24"/>
-          <w:szCs w:val="24"/>
-        </w:rPr>
-      </w:pPr>
-      <w:r>
-        <w:rPr>
-          <w:rFonts w:ascii="Times New Roman" w:hAnsi="Times New Roman" w:cs="Times New Roman"/>
-          <w:sz w:val="24"/>
-          <w:szCs w:val="24"/>
-        </w:rPr>
-        <w:t>Work Breakdown Structure (WBS)</w:t>
-      </w:r>
-    </w:p>
-    <w:p>
-      <w:pPr>
-        <w:pStyle w:val="ListParagraph"/>
-        <w:numPr>
-          <w:ilvl w:val="1"/>
-          <w:numId w:val="7"/>
-        </w:numPr>
-        <w:spacing w:line="360" w:lineRule="auto"/>
-        <w:jc w:val="both"/>
-        <w:rPr>
-          <w:rFonts w:ascii="Times New Roman" w:hAnsi="Times New Roman" w:cs="Times New Roman"/>
-          <w:sz w:val="24"/>
-          <w:szCs w:val="24"/>
-        </w:rPr>
-      </w:pPr>
-      <w:r>
-        <w:rPr>
-          <w:rFonts w:ascii="Times New Roman" w:hAnsi="Times New Roman" w:cs="Times New Roman"/>
-          <w:sz w:val="24"/>
-          <w:szCs w:val="24"/>
-        </w:rPr>
-        <w:t>Gantt Chart</w:t>
-      </w:r>
-    </w:p>
-    <w:p>
-      <w:pPr>
-        <w:pStyle w:val="ListParagraph"/>
-        <w:numPr>
-          <w:ilvl w:val="1"/>
-          <w:numId w:val="7"/>
-        </w:numPr>
-        <w:spacing w:line="360" w:lineRule="auto"/>
-        <w:jc w:val="both"/>
-        <w:rPr>
-          <w:rFonts w:ascii="Times New Roman" w:hAnsi="Times New Roman" w:cs="Times New Roman"/>
-          <w:sz w:val="24"/>
-          <w:szCs w:val="24"/>
-        </w:rPr>
-      </w:pPr>
-      <w:r>
-        <w:rPr>
-          <w:rFonts w:ascii="Times New Roman" w:hAnsi="Times New Roman" w:cs="Times New Roman"/>
-          <w:sz w:val="24"/>
-          <w:szCs w:val="24"/>
-        </w:rPr>
-        <w:t>Milestones</w:t>
-      </w:r>
-    </w:p>
-    <w:p>
-      <w:pPr>
-        <w:pStyle w:val="ListParagraph"/>
-        <w:spacing w:line="360" w:lineRule="auto"/>
-        <w:ind w:left="1440"/>
-        <w:jc w:val="both"/>
-        <w:rPr>
-          <w:rFonts w:ascii="Times New Roman" w:hAnsi="Times New Roman" w:cs="Times New Roman"/>
-          <w:sz w:val="24"/>
-          <w:szCs w:val="24"/>
-        </w:rPr>
-      </w:pPr>
-    </w:p>
-    <w:p>
-      <w:pPr>
-        <w:pStyle w:val="ListParagraph"/>
-        <w:numPr>
-          <w:ilvl w:val="0"/>
-          <w:numId w:val="7"/>
-        </w:numPr>
-        <w:spacing w:line="360" w:lineRule="auto"/>
-        <w:jc w:val="both"/>
-        <w:rPr>
-          <w:rFonts w:ascii="Times New Roman" w:hAnsi="Times New Roman" w:cs="Times New Roman"/>
-          <w:b/>
-          <w:bCs/>
-          <w:sz w:val="24"/>
-          <w:szCs w:val="24"/>
-        </w:rPr>
-      </w:pPr>
-      <w:r>
-        <w:rPr>
-          <w:rFonts w:ascii="Times New Roman" w:hAnsi="Times New Roman" w:cs="Times New Roman"/>
-          <w:b/>
-          <w:bCs/>
-          <w:sz w:val="24"/>
-          <w:szCs w:val="24"/>
-        </w:rPr>
-        <w:t>Technical Description</w:t>
-      </w:r>
-    </w:p>
-    <w:p>
-      <w:pPr>
-        <w:pStyle w:val="ListParagraph"/>
-        <w:numPr>
-          <w:ilvl w:val="1"/>
-          <w:numId w:val="7"/>
-        </w:numPr>
-        <w:spacing w:line="360" w:lineRule="auto"/>
+        <w:spacing w:before="240" w:line="360" w:lineRule="auto"/>
         <w:jc w:val="both"/>
         <w:rPr>
           <w:rFonts w:ascii="Times New Roman" w:hAnsi="Times New Roman" w:cs="Times New Roman"/>
@@ -1253,7 +1988,7 @@
           <w:p>
             <w:pPr>
               <w:pStyle w:val="ListParagraph"/>
-              <w:spacing w:line="360" w:lineRule="auto"/>
+              <w:spacing w:before="240" w:line="360" w:lineRule="auto"/>
               <w:ind w:left="0"/>
               <w:jc w:val="both"/>
               <w:rPr>
@@ -1283,7 +2018,7 @@
           <w:p>
             <w:pPr>
               <w:pStyle w:val="ListParagraph"/>
-              <w:spacing w:line="360" w:lineRule="auto"/>
+              <w:spacing w:before="240" w:line="360" w:lineRule="auto"/>
               <w:ind w:left="0"/>
               <w:jc w:val="both"/>
               <w:rPr>
@@ -1313,7 +2048,7 @@
           <w:p>
             <w:pPr>
               <w:pStyle w:val="ListParagraph"/>
-              <w:spacing w:line="360" w:lineRule="auto"/>
+              <w:spacing w:before="240" w:line="360" w:lineRule="auto"/>
               <w:ind w:left="0"/>
               <w:jc w:val="both"/>
               <w:rPr>
@@ -1343,7 +2078,7 @@
           <w:p>
             <w:pPr>
               <w:pStyle w:val="ListParagraph"/>
-              <w:spacing w:line="360" w:lineRule="auto"/>
+              <w:spacing w:before="240" w:line="360" w:lineRule="auto"/>
               <w:ind w:left="0"/>
               <w:jc w:val="both"/>
               <w:rPr>
@@ -1375,7 +2110,7 @@
           <w:p>
             <w:pPr>
               <w:pStyle w:val="ListParagraph"/>
-              <w:spacing w:line="360" w:lineRule="auto"/>
+              <w:spacing w:before="240" w:line="360" w:lineRule="auto"/>
               <w:ind w:left="0"/>
               <w:jc w:val="both"/>
               <w:rPr>
@@ -1401,7 +2136,7 @@
           <w:p>
             <w:pPr>
               <w:pStyle w:val="ListParagraph"/>
-              <w:spacing w:line="360" w:lineRule="auto"/>
+              <w:spacing w:before="240" w:line="360" w:lineRule="auto"/>
               <w:ind w:left="0"/>
               <w:jc w:val="center"/>
               <w:rPr>
@@ -1427,7 +2162,7 @@
           <w:p>
             <w:pPr>
               <w:pStyle w:val="ListParagraph"/>
-              <w:spacing w:line="360" w:lineRule="auto"/>
+              <w:spacing w:before="240" w:line="360" w:lineRule="auto"/>
               <w:ind w:left="0"/>
               <w:jc w:val="center"/>
               <w:rPr>
@@ -1453,7 +2188,7 @@
           <w:p>
             <w:pPr>
               <w:pStyle w:val="ListParagraph"/>
-              <w:spacing w:line="360" w:lineRule="auto"/>
+              <w:spacing w:before="240" w:line="360" w:lineRule="auto"/>
               <w:ind w:left="0"/>
               <w:jc w:val="both"/>
               <w:rPr>
@@ -1481,7 +2216,7 @@
           <w:p>
             <w:pPr>
               <w:pStyle w:val="ListParagraph"/>
-              <w:spacing w:line="360" w:lineRule="auto"/>
+              <w:spacing w:before="240" w:line="360" w:lineRule="auto"/>
               <w:ind w:left="0"/>
               <w:jc w:val="both"/>
               <w:rPr>
@@ -1507,7 +2242,7 @@
           <w:p>
             <w:pPr>
               <w:pStyle w:val="ListParagraph"/>
-              <w:spacing w:line="360" w:lineRule="auto"/>
+              <w:spacing w:before="240" w:line="360" w:lineRule="auto"/>
               <w:ind w:left="0"/>
               <w:jc w:val="center"/>
               <w:rPr>
@@ -1533,7 +2268,7 @@
           <w:p>
             <w:pPr>
               <w:pStyle w:val="ListParagraph"/>
-              <w:spacing w:line="360" w:lineRule="auto"/>
+              <w:spacing w:before="240" w:line="360" w:lineRule="auto"/>
               <w:ind w:left="0"/>
               <w:jc w:val="center"/>
               <w:rPr>
@@ -1559,7 +2294,7 @@
           <w:p>
             <w:pPr>
               <w:pStyle w:val="ListParagraph"/>
-              <w:spacing w:line="360" w:lineRule="auto"/>
+              <w:spacing w:before="240" w:line="360" w:lineRule="auto"/>
               <w:ind w:left="0"/>
               <w:jc w:val="both"/>
               <w:rPr>
@@ -1587,7 +2322,7 @@
           <w:p>
             <w:pPr>
               <w:pStyle w:val="ListParagraph"/>
-              <w:spacing w:line="360" w:lineRule="auto"/>
+              <w:spacing w:before="240" w:line="360" w:lineRule="auto"/>
               <w:ind w:left="0"/>
               <w:jc w:val="both"/>
               <w:rPr>
@@ -1613,7 +2348,7 @@
           <w:p>
             <w:pPr>
               <w:pStyle w:val="ListParagraph"/>
-              <w:spacing w:line="360" w:lineRule="auto"/>
+              <w:spacing w:before="240" w:line="360" w:lineRule="auto"/>
               <w:ind w:left="0"/>
               <w:jc w:val="center"/>
               <w:rPr>
@@ -1639,7 +2374,7 @@
           <w:p>
             <w:pPr>
               <w:pStyle w:val="ListParagraph"/>
-              <w:spacing w:line="360" w:lineRule="auto"/>
+              <w:spacing w:before="240" w:line="360" w:lineRule="auto"/>
               <w:ind w:left="0"/>
               <w:jc w:val="center"/>
               <w:rPr>
@@ -1665,7 +2400,7 @@
           <w:p>
             <w:pPr>
               <w:pStyle w:val="ListParagraph"/>
-              <w:spacing w:line="360" w:lineRule="auto"/>
+              <w:spacing w:before="240" w:line="360" w:lineRule="auto"/>
               <w:ind w:left="0"/>
               <w:jc w:val="both"/>
               <w:rPr>
@@ -1693,7 +2428,7 @@
           <w:p>
             <w:pPr>
               <w:pStyle w:val="ListParagraph"/>
-              <w:spacing w:line="360" w:lineRule="auto"/>
+              <w:spacing w:before="240" w:line="360" w:lineRule="auto"/>
               <w:ind w:left="0"/>
               <w:jc w:val="both"/>
               <w:rPr>
@@ -1719,7 +2454,7 @@
           <w:p>
             <w:pPr>
               <w:pStyle w:val="ListParagraph"/>
-              <w:spacing w:line="360" w:lineRule="auto"/>
+              <w:spacing w:before="240" w:line="360" w:lineRule="auto"/>
               <w:ind w:left="0"/>
               <w:jc w:val="center"/>
               <w:rPr>
@@ -1745,7 +2480,7 @@
           <w:p>
             <w:pPr>
               <w:pStyle w:val="ListParagraph"/>
-              <w:spacing w:line="360" w:lineRule="auto"/>
+              <w:spacing w:before="240" w:line="360" w:lineRule="auto"/>
               <w:ind w:left="0"/>
               <w:jc w:val="center"/>
               <w:rPr>
@@ -1771,7 +2506,7 @@
           <w:p>
             <w:pPr>
               <w:pStyle w:val="ListParagraph"/>
-              <w:spacing w:line="360" w:lineRule="auto"/>
+              <w:spacing w:before="240" w:line="360" w:lineRule="auto"/>
               <w:ind w:left="0"/>
               <w:jc w:val="both"/>
               <w:rPr>
@@ -1799,7 +2534,7 @@
           <w:p>
             <w:pPr>
               <w:pStyle w:val="ListParagraph"/>
-              <w:spacing w:line="360" w:lineRule="auto"/>
+              <w:spacing w:before="240" w:line="360" w:lineRule="auto"/>
               <w:ind w:left="0"/>
               <w:jc w:val="both"/>
               <w:rPr>
@@ -1825,7 +2560,7 @@
           <w:p>
             <w:pPr>
               <w:pStyle w:val="ListParagraph"/>
-              <w:spacing w:line="360" w:lineRule="auto"/>
+              <w:spacing w:before="240" w:line="360" w:lineRule="auto"/>
               <w:ind w:left="0"/>
               <w:jc w:val="center"/>
               <w:rPr>
@@ -1851,7 +2586,7 @@
           <w:p>
             <w:pPr>
               <w:pStyle w:val="ListParagraph"/>
-              <w:spacing w:line="360" w:lineRule="auto"/>
+              <w:spacing w:before="240" w:line="360" w:lineRule="auto"/>
               <w:ind w:left="0"/>
               <w:jc w:val="center"/>
               <w:rPr>
@@ -1877,7 +2612,7 @@
           <w:p>
             <w:pPr>
               <w:pStyle w:val="ListParagraph"/>
-              <w:spacing w:line="360" w:lineRule="auto"/>
+              <w:spacing w:before="240" w:line="360" w:lineRule="auto"/>
               <w:ind w:left="0"/>
               <w:jc w:val="both"/>
               <w:rPr>
@@ -1901,7 +2636,7 @@
     <w:p>
       <w:pPr>
         <w:pStyle w:val="ListParagraph"/>
-        <w:spacing w:line="360" w:lineRule="auto"/>
+        <w:spacing w:before="240" w:line="360" w:lineRule="auto"/>
         <w:ind w:left="1440"/>
         <w:jc w:val="both"/>
         <w:rPr>
@@ -1918,7 +2653,7 @@
           <w:ilvl w:val="1"/>
           <w:numId w:val="7"/>
         </w:numPr>
-        <w:spacing w:line="360" w:lineRule="auto"/>
+        <w:spacing w:before="240" w:line="360" w:lineRule="auto"/>
         <w:jc w:val="both"/>
         <w:rPr>
           <w:rFonts w:ascii="Times New Roman" w:hAnsi="Times New Roman" w:cs="Times New Roman"/>
@@ -1964,7 +2699,7 @@
                 <w:ilvl w:val="0"/>
                 <w:numId w:val="7"/>
               </w:numPr>
-              <w:spacing w:line="360" w:lineRule="auto"/>
+              <w:spacing w:before="240" w:line="360" w:lineRule="auto"/>
               <w:jc w:val="both"/>
               <w:rPr>
                 <w:rFonts w:ascii="Times New Roman" w:hAnsi="Times New Roman" w:cs="Times New Roman"/>
@@ -1993,7 +2728,7 @@
           <w:p>
             <w:pPr>
               <w:pStyle w:val="ListParagraph"/>
-              <w:spacing w:line="360" w:lineRule="auto"/>
+              <w:spacing w:before="240" w:line="360" w:lineRule="auto"/>
               <w:ind w:left="0"/>
               <w:jc w:val="both"/>
               <w:rPr>
@@ -2023,7 +2758,7 @@
           <w:p>
             <w:pPr>
               <w:pStyle w:val="ListParagraph"/>
-              <w:spacing w:line="360" w:lineRule="auto"/>
+              <w:spacing w:before="240" w:line="360" w:lineRule="auto"/>
               <w:ind w:left="0"/>
               <w:jc w:val="both"/>
               <w:rPr>
@@ -2053,7 +2788,7 @@
           <w:p>
             <w:pPr>
               <w:pStyle w:val="ListParagraph"/>
-              <w:spacing w:line="360" w:lineRule="auto"/>
+              <w:spacing w:before="240" w:line="360" w:lineRule="auto"/>
               <w:ind w:left="0"/>
               <w:jc w:val="both"/>
               <w:rPr>
@@ -2085,7 +2820,7 @@
           <w:p>
             <w:pPr>
               <w:pStyle w:val="ListParagraph"/>
-              <w:spacing w:line="360" w:lineRule="auto"/>
+              <w:spacing w:before="240" w:line="360" w:lineRule="auto"/>
               <w:ind w:left="0"/>
               <w:jc w:val="both"/>
               <w:rPr>
@@ -2111,7 +2846,7 @@
           <w:p>
             <w:pPr>
               <w:pStyle w:val="ListParagraph"/>
-              <w:spacing w:line="360" w:lineRule="auto"/>
+              <w:spacing w:before="240" w:line="360" w:lineRule="auto"/>
               <w:ind w:left="0"/>
               <w:jc w:val="center"/>
               <w:rPr>
@@ -2137,7 +2872,7 @@
           <w:p>
             <w:pPr>
               <w:pStyle w:val="ListParagraph"/>
-              <w:spacing w:line="360" w:lineRule="auto"/>
+              <w:spacing w:before="240" w:line="360" w:lineRule="auto"/>
               <w:ind w:left="0"/>
               <w:jc w:val="center"/>
               <w:rPr>
@@ -2163,7 +2898,7 @@
           <w:p>
             <w:pPr>
               <w:pStyle w:val="ListParagraph"/>
-              <w:spacing w:line="360" w:lineRule="auto"/>
+              <w:spacing w:before="240" w:line="360" w:lineRule="auto"/>
               <w:ind w:left="0"/>
               <w:jc w:val="both"/>
               <w:rPr>
@@ -2186,7 +2921,7 @@
     </w:tbl>
     <w:p>
       <w:pPr>
-        <w:spacing w:line="360" w:lineRule="auto"/>
+        <w:spacing w:before="240" w:line="360" w:lineRule="auto"/>
         <w:jc w:val="both"/>
         <w:rPr>
           <w:rFonts w:ascii="Times New Roman" w:hAnsi="Times New Roman" w:cs="Times New Roman"/>
@@ -2197,6 +2932,7 @@
     </w:p>
     <w:p>
       <w:pPr>
+        <w:spacing w:before="240" w:line="360" w:lineRule="auto"/>
         <w:rPr>
           <w:rFonts w:ascii="Times New Roman" w:hAnsi="Times New Roman" w:cs="Times New Roman"/>
           <w:sz w:val="24"/>
@@ -2219,7 +2955,7 @@
           <w:ilvl w:val="0"/>
           <w:numId w:val="7"/>
         </w:numPr>
-        <w:spacing w:line="360" w:lineRule="auto"/>
+        <w:spacing w:before="240" w:line="360" w:lineRule="auto"/>
         <w:jc w:val="both"/>
         <w:rPr>
           <w:rFonts w:ascii="Times New Roman" w:hAnsi="Times New Roman" w:cs="Times New Roman"/>
@@ -2262,7 +2998,7 @@
           <w:p>
             <w:pPr>
               <w:pStyle w:val="ListParagraph"/>
-              <w:spacing w:line="360" w:lineRule="auto"/>
+              <w:spacing w:before="240" w:line="360" w:lineRule="auto"/>
               <w:ind w:left="0"/>
               <w:jc w:val="both"/>
               <w:rPr>
@@ -2292,7 +3028,7 @@
           <w:p>
             <w:pPr>
               <w:pStyle w:val="ListParagraph"/>
-              <w:spacing w:line="360" w:lineRule="auto"/>
+              <w:spacing w:before="240" w:line="360" w:lineRule="auto"/>
               <w:ind w:left="0"/>
               <w:jc w:val="both"/>
               <w:rPr>
@@ -2322,7 +3058,7 @@
           <w:p>
             <w:pPr>
               <w:pStyle w:val="ListParagraph"/>
-              <w:spacing w:line="360" w:lineRule="auto"/>
+              <w:spacing w:before="240" w:line="360" w:lineRule="auto"/>
               <w:ind w:left="0"/>
               <w:jc w:val="both"/>
               <w:rPr>
@@ -2352,7 +3088,7 @@
           <w:p>
             <w:pPr>
               <w:pStyle w:val="ListParagraph"/>
-              <w:spacing w:line="360" w:lineRule="auto"/>
+              <w:spacing w:before="240" w:line="360" w:lineRule="auto"/>
               <w:ind w:left="0"/>
               <w:jc w:val="both"/>
               <w:rPr>
@@ -2384,7 +3120,7 @@
           <w:p>
             <w:pPr>
               <w:pStyle w:val="ListParagraph"/>
-              <w:spacing w:line="360" w:lineRule="auto"/>
+              <w:spacing w:before="240" w:line="360" w:lineRule="auto"/>
               <w:ind w:left="0"/>
               <w:jc w:val="both"/>
               <w:rPr>
@@ -2410,7 +3146,7 @@
           <w:p>
             <w:pPr>
               <w:pStyle w:val="ListParagraph"/>
-              <w:spacing w:line="360" w:lineRule="auto"/>
+              <w:spacing w:before="240" w:line="360" w:lineRule="auto"/>
               <w:ind w:left="0"/>
               <w:jc w:val="center"/>
               <w:rPr>
@@ -2436,7 +3172,7 @@
           <w:p>
             <w:pPr>
               <w:pStyle w:val="ListParagraph"/>
-              <w:spacing w:line="360" w:lineRule="auto"/>
+              <w:spacing w:before="240" w:line="360" w:lineRule="auto"/>
               <w:ind w:left="0"/>
               <w:jc w:val="center"/>
               <w:rPr>
@@ -2462,7 +3198,7 @@
           <w:p>
             <w:pPr>
               <w:pStyle w:val="ListParagraph"/>
-              <w:spacing w:line="360" w:lineRule="auto"/>
+              <w:spacing w:before="240" w:line="360" w:lineRule="auto"/>
               <w:ind w:left="0"/>
               <w:jc w:val="both"/>
               <w:rPr>
@@ -2490,7 +3226,7 @@
           <w:p>
             <w:pPr>
               <w:pStyle w:val="ListParagraph"/>
-              <w:spacing w:line="360" w:lineRule="auto"/>
+              <w:spacing w:before="240" w:line="360" w:lineRule="auto"/>
               <w:ind w:left="0"/>
               <w:jc w:val="both"/>
               <w:rPr>
@@ -2516,7 +3252,7 @@
           <w:p>
             <w:pPr>
               <w:pStyle w:val="ListParagraph"/>
-              <w:spacing w:line="360" w:lineRule="auto"/>
+              <w:spacing w:before="240" w:line="360" w:lineRule="auto"/>
               <w:ind w:left="0"/>
               <w:jc w:val="center"/>
               <w:rPr>
@@ -2542,7 +3278,7 @@
           <w:p>
             <w:pPr>
               <w:pStyle w:val="ListParagraph"/>
-              <w:spacing w:line="360" w:lineRule="auto"/>
+              <w:spacing w:before="240" w:line="360" w:lineRule="auto"/>
               <w:ind w:left="0"/>
               <w:jc w:val="center"/>
               <w:rPr>
@@ -2568,7 +3304,7 @@
           <w:p>
             <w:pPr>
               <w:pStyle w:val="ListParagraph"/>
-              <w:spacing w:line="360" w:lineRule="auto"/>
+              <w:spacing w:before="240" w:line="360" w:lineRule="auto"/>
               <w:ind w:left="0"/>
               <w:jc w:val="both"/>
               <w:rPr>
@@ -2596,7 +3332,7 @@
           <w:p>
             <w:pPr>
               <w:pStyle w:val="ListParagraph"/>
-              <w:spacing w:line="360" w:lineRule="auto"/>
+              <w:spacing w:before="240" w:line="360" w:lineRule="auto"/>
               <w:ind w:left="0"/>
               <w:jc w:val="both"/>
               <w:rPr>
@@ -2622,7 +3358,7 @@
           <w:p>
             <w:pPr>
               <w:pStyle w:val="ListParagraph"/>
-              <w:spacing w:line="360" w:lineRule="auto"/>
+              <w:spacing w:before="240" w:line="360" w:lineRule="auto"/>
               <w:ind w:left="0"/>
               <w:jc w:val="center"/>
               <w:rPr>
@@ -2648,7 +3384,7 @@
           <w:p>
             <w:pPr>
               <w:pStyle w:val="ListParagraph"/>
-              <w:spacing w:line="360" w:lineRule="auto"/>
+              <w:spacing w:before="240" w:line="360" w:lineRule="auto"/>
               <w:ind w:left="0"/>
               <w:jc w:val="center"/>
               <w:rPr>
@@ -2674,7 +3410,7 @@
           <w:p>
             <w:pPr>
               <w:pStyle w:val="ListParagraph"/>
-              <w:spacing w:line="360" w:lineRule="auto"/>
+              <w:spacing w:before="240" w:line="360" w:lineRule="auto"/>
               <w:ind w:left="0"/>
               <w:jc w:val="both"/>
               <w:rPr>
@@ -2698,7 +3434,121 @@
     <w:p>
       <w:pPr>
         <w:pStyle w:val="ListParagraph"/>
-        <w:spacing w:line="360" w:lineRule="auto"/>
+        <w:spacing w:before="240" w:line="360" w:lineRule="auto"/>
+        <w:jc w:val="both"/>
+        <w:rPr>
+          <w:rFonts w:ascii="Times New Roman" w:hAnsi="Times New Roman" w:cs="Times New Roman"/>
+          <w:sz w:val="24"/>
+          <w:szCs w:val="24"/>
+        </w:rPr>
+      </w:pPr>
+    </w:p>
+    <w:p>
+      <w:pPr>
+        <w:spacing w:before="240" w:line="360" w:lineRule="auto"/>
+        <w:rPr>
+          <w:rFonts w:ascii="Times New Roman" w:hAnsi="Times New Roman" w:cs="Times New Roman"/>
+          <w:sz w:val="24"/>
+          <w:szCs w:val="24"/>
+        </w:rPr>
+      </w:pPr>
+      <w:r>
+        <w:rPr>
+          <w:rFonts w:ascii="Times New Roman" w:hAnsi="Times New Roman" w:cs="Times New Roman"/>
+          <w:sz w:val="24"/>
+          <w:szCs w:val="24"/>
+        </w:rPr>
+        <w:br w:type="page"/>
+      </w:r>
+    </w:p>
+    <w:sdt>
+      <w:sdtPr>
+        <w:id w:val="18667245"/>
+        <w:docPartObj>
+          <w:docPartGallery w:val="Bibliographies"/>
+          <w:docPartUnique/>
+        </w:docPartObj>
+      </w:sdtPr>
+      <w:sdtEndPr>
+        <w:rPr>
+          <w:rFonts w:asciiTheme="minorHAnsi" w:eastAsiaTheme="minorHAnsi" w:hAnsiTheme="minorHAnsi" w:cstheme="minorBidi"/>
+          <w:b/>
+          <w:bCs/>
+          <w:color w:val="auto"/>
+          <w:sz w:val="22"/>
+          <w:szCs w:val="22"/>
+        </w:rPr>
+      </w:sdtEndPr>
+      <w:sdtContent>
+        <w:p>
+          <w:pPr>
+            <w:pStyle w:val="Heading1"/>
+            <w:spacing w:before="240" w:line="360" w:lineRule="auto"/>
+          </w:pPr>
+          <w:r>
+            <w:t>Works Cited</w:t>
+          </w:r>
+        </w:p>
+        <w:p>
+          <w:pPr>
+            <w:pStyle w:val="Bibliography"/>
+            <w:ind w:left="720" w:hanging="720"/>
+            <w:rPr>
+              <w:rFonts w:cs="Times New Roman"/>
+              <w:noProof/>
+              <w:kern w:val="0"/>
+              <w:sz w:val="24"/>
+              <w14:ligatures w14:val="none"/>
+            </w:rPr>
+          </w:pPr>
+          <w:r>
+            <w:fldChar w:fldCharType="begin"/>
+          </w:r>
+          <w:r>
+            <w:instrText xml:space="preserve"> BIBLIOGRAPHY </w:instrText>
+          </w:r>
+          <w:r>
+            <w:fldChar w:fldCharType="separate"/>
+          </w:r>
+          <w:r>
+            <w:rPr>
+              <w:noProof/>
+            </w:rPr>
+            <w:t xml:space="preserve">Chang Wei Jie. (April 23, 2026). Waste Management in Malaysia: The Complete Enterprise Guide (2026). </w:t>
+          </w:r>
+          <w:r>
+            <w:rPr>
+              <w:i/>
+              <w:iCs/>
+              <w:noProof/>
+            </w:rPr>
+            <w:t>gargeon.com</w:t>
+          </w:r>
+          <w:r>
+            <w:rPr>
+              <w:noProof/>
+            </w:rPr>
+            <w:t>.</w:t>
+          </w:r>
+        </w:p>
+        <w:p>
+          <w:pPr>
+            <w:spacing w:before="240" w:line="360" w:lineRule="auto"/>
+          </w:pPr>
+          <w:r>
+            <w:rPr>
+              <w:b/>
+              <w:bCs/>
+            </w:rPr>
+            <w:fldChar w:fldCharType="end"/>
+          </w:r>
+        </w:p>
+      </w:sdtContent>
+    </w:sdt>
+    <w:p>
+      <w:pPr>
+        <w:pStyle w:val="ListParagraph"/>
+        <w:spacing w:before="240" w:line="360" w:lineRule="auto"/>
         <w:jc w:val="both"/>
         <w:rPr>
           <w:rFonts w:ascii="Times New Roman" w:hAnsi="Times New Roman" w:cs="Times New Roman"/>
@@ -2718,8 +3568,347 @@
 </file>
 
 <file path=word/numbering.xml><?xml version="1.0" encoding="utf-8"?>
-<w:numbering xmlns:wpc="http://schemas.microsoft.com/office/word/2010/wordprocessingCanvas" xmlns:cx="http://schemas.microsoft.com/office/drawing/2014/chartex" xmlns:cx1="http://schemas.microsoft.com/office/drawing/2015/9/8/chartex" xmlns:cx2="http://schemas.microsoft.com/office/drawing/2015/10/21/chartex" xmlns:cx3="http://schemas.microsoft.com/office/drawing/2016/5/9/chartex" xmlns:cx4="http://schemas.microsoft.com/office/drawing/2016/5/10/chartex" xmlns:cx5="http://schemas.microsoft.com/office/drawing/2016/5/11/chartex" xmlns:cx6="http://schemas.microsoft.com/office/drawing/2016/5/12/chartex" xmlns:cx7="http://schemas.microsoft.com/office/drawing/2016/5/13/chartex" xmlns:cx8="http://schemas.microsoft.com/office/drawing/2016/5/14/chartex" xmlns:mc="http://schemas.openxmlformats.org/markup-compatibility/2006" xmlns:aink="http://schemas.microsoft.com/office/drawing/2016/ink" xmlns:am3d="http://schemas.microsoft.com/office/drawing/2017/model3d" xmlns:o="urn:schemas-microsoft-com:office:office" xmlns:oel="http://schemas.microsoft.com/office/2019/extlst" xmlns:r="http://schemas.openxmlformats.org/officeDocument/2006/relationships" xmlns:m="http://schemas.openxmlformats.org/officeDocument/2006/math" xmlns:v="urn:schemas-microsoft-com:vml" xmlns:wp14="http://schemas.microsoft.com/office/word/2010/wordprocessingDrawing" xmlns:wp="http://schemas.openxmlformats.org/drawingml/2006/wordprocessingDrawing" xmlns:w10="urn:schemas-microsoft-com:office:word" xmlns:w="http://schemas.openxmlformats.org/wordprocessingml/2006/main" xmlns:w14="http://schemas.microsoft.com/office/word/2010/wordml" xmlns:w15="http://schemas.microsoft.com/office/word/2012/wordml" xmlns:w16cex="http://schemas.microsoft.com/office/word/2018/wordml/cex" xmlns:w16cid="http://schemas.microsoft.com/office/word/2016/wordml/cid" xmlns:w16="http://schemas.microsoft.com/office/word/2018/wordml" xmlns:w16sdtdh="http://schemas.microsoft.com/office/word/2020/wordml/sdtdatahash" xmlns:w16se="http://schemas.microsoft.com/office/word/2015/wordml/symex" xmlns:wpg="http://schemas.microsoft.com/office/word/2010/wordprocessingGroup" xmlns:wpi="http://schemas.microsoft.com/office/word/2010/wordprocessingInk" xmlns:wne="http://schemas.microsoft.com/office/word/2006/wordml" xmlns:wps="http://schemas.microsoft.com/office/word/2010/wordprocessingShape" mc:Ignorable="w14 w15 w16se w16cid w16 w16cex w16sdtdh wp14">
+<w:numbering xmlns:wpc="http://schemas.microsoft.com/office/word/2010/wordprocessingCanvas" xmlns:cx="http://schemas.microsoft.com/office/drawing/2014/chartex" xmlns:cx1="http://schemas.microsoft.com/office/drawing/2015/9/8/chartex" xmlns:cx2="http://schemas.microsoft.com/office/drawing/2015/10/21/chartex" xmlns:cx3="http://schemas.microsoft.com/office/drawing/2016/5/9/chartex" xmlns:cx4="http://schemas.microsoft.com/office/drawing/2016/5/10/chartex" xmlns:cx5="http://schemas.microsoft.com/office/drawing/2016/5/11/chartex" xmlns:cx6="http://schemas.microsoft.com/office/drawing/2016/5/12/chartex" xmlns:cx7="http://schemas.microsoft.com/office/drawing/2016/5/13/chartex" xmlns:cx8="http://schemas.microsoft.com/office/drawing/2016/5/14/chartex" xmlns:mc="http://schemas.openxmlformats.org/markup-compatibility/2006" xmlns:aink="http://schemas.microsoft.com/office/drawing/2016/ink" xmlns:am3d="http://schemas.microsoft.com/office/drawing/2017/model3d" xmlns:o="urn:schemas-microsoft-com:office:office" xmlns:oel="http://schemas.microsoft.com/office/2019/extlst" xmlns:r="http://schemas.openxmlformats.org/officeDocument/2006/relationships" xmlns:m="http://schemas.openxmlformats.org/officeDocument/2006/math" xmlns:v="urn:schemas-microsoft-com:vml" xmlns:wp14="http://schemas.microsoft.com/office/word/2010/wordprocessingDrawing" xmlns:wp="http://schemas.openxmlformats.org/drawingml/2006/wordprocessingDrawing" xmlns:w10="urn:schemas-microsoft-com:office:word" xmlns:w="http://schemas.openxmlformats.org/wordprocessingml/2006/main" xmlns:w14="http://schemas.microsoft.com/office/word/2010/wordml" xmlns:w15="http://schemas.microsoft.com/office/word/2012/wordml" xmlns:w16cex="http://schemas.microsoft.com/office/word/2018/wordml/cex" xmlns:w16cid="http://schemas.microsoft.com/office/word/2016/wordml/cid" xmlns:w16="http://schemas.microsoft.com/office/word/2018/wordml" xmlns:w16du="http://schemas.microsoft.com/office/word/2023/wordml/word16du" xmlns:w16sdtdh="http://schemas.microsoft.com/office/word/2020/wordml/sdtdatahash" xmlns:w16se="http://schemas.microsoft.com/office/word/2015/wordml/symex" xmlns:wpg="http://schemas.microsoft.com/office/word/2010/wordprocessingGroup" xmlns:wpi="http://schemas.microsoft.com/office/word/2010/wordprocessingInk" xmlns:wne="http://schemas.microsoft.com/office/word/2006/wordml" xmlns:wps="http://schemas.microsoft.com/office/word/2010/wordprocessingShape" mc:Ignorable="w14 w15 w16se w16cid w16 w16cex w16sdtdh wp14">
   <w:abstractNum w:abstractNumId="0" w15:restartNumberingAfterBreak="0">
+    <w:nsid w:val="2AEF3CF5"/>
+    <w:multiLevelType w:val="hybridMultilevel"/>
+    <w:tmpl w:val="85D25698"/>
+    <w:lvl w:ilvl="0" w:tplc="04090001">
+      <w:start w:val="1"/>
+      <w:numFmt w:val="bullet"/>
+      <w:lvlText w:val=""/>
+      <w:lvlJc w:val="left"/>
+      <w:pPr>
+        <w:ind w:left="720" w:hanging="360"/>
+      </w:pPr>
+      <w:rPr>
+        <w:rFonts w:ascii="Symbol" w:hAnsi="Symbol" w:hint="default"/>
+      </w:rPr>
+    </w:lvl>
+    <w:lvl w:ilvl="1" w:tplc="04090003" w:tentative="1">
+      <w:start w:val="1"/>
+      <w:numFmt w:val="bullet"/>
+      <w:lvlText w:val="o"/>
+      <w:lvlJc w:val="left"/>
+      <w:pPr>
+        <w:ind w:left="1440" w:hanging="360"/>
+      </w:pPr>
+      <w:rPr>
+        <w:rFonts w:ascii="Courier New" w:hAnsi="Courier New" w:cs="Courier New" w:hint="default"/>
+      </w:rPr>
+    </w:lvl>
+    <w:lvl w:ilvl="2" w:tplc="04090005" w:tentative="1">
+      <w:start w:val="1"/>
+      <w:numFmt w:val="bullet"/>
+      <w:lvlText w:val=""/>
+      <w:lvlJc w:val="left"/>
+      <w:pPr>
+        <w:ind w:left="2160" w:hanging="360"/>
+      </w:pPr>
+      <w:rPr>
+        <w:rFonts w:ascii="Wingdings" w:hAnsi="Wingdings" w:hint="default"/>
+      </w:rPr>
+    </w:lvl>
+    <w:lvl w:ilvl="3" w:tplc="04090001" w:tentative="1">
+      <w:start w:val="1"/>
+      <w:numFmt w:val="bullet"/>
+      <w:lvlText w:val=""/>
+      <w:lvlJc w:val="left"/>
+      <w:pPr>
+        <w:ind w:left="2880" w:hanging="360"/>
+      </w:pPr>
+      <w:rPr>
+        <w:rFonts w:ascii="Symbol" w:hAnsi="Symbol" w:hint="default"/>
+      </w:rPr>
+    </w:lvl>
+    <w:lvl w:ilvl="4" w:tplc="04090003" w:tentative="1">
+      <w:start w:val="1"/>
+      <w:numFmt w:val="bullet"/>
+      <w:lvlText w:val="o"/>
+      <w:lvlJc w:val="left"/>
+      <w:pPr>
+        <w:ind w:left="3600" w:hanging="360"/>
+      </w:pPr>
+      <w:rPr>
+        <w:rFonts w:ascii="Courier New" w:hAnsi="Courier New" w:cs="Courier New" w:hint="default"/>
+      </w:rPr>
+    </w:lvl>
+    <w:lvl w:ilvl="5" w:tplc="04090005" w:tentative="1">
+      <w:start w:val="1"/>
+      <w:numFmt w:val="bullet"/>
+      <w:lvlText w:val=""/>
+      <w:lvlJc w:val="left"/>
+      <w:pPr>
+        <w:ind w:left="4320" w:hanging="360"/>
+      </w:pPr>
+      <w:rPr>
+        <w:rFonts w:ascii="Wingdings" w:hAnsi="Wingdings" w:hint="default"/>
+      </w:rPr>
+    </w:lvl>
+    <w:lvl w:ilvl="6" w:tplc="04090001" w:tentative="1">
+      <w:start w:val="1"/>
+      <w:numFmt w:val="bullet"/>
+      <w:lvlText w:val=""/>
+      <w:lvlJc w:val="left"/>
+      <w:pPr>
+        <w:ind w:left="5040" w:hanging="360"/>
+      </w:pPr>
+      <w:rPr>
+        <w:rFonts w:ascii="Symbol" w:hAnsi="Symbol" w:hint="default"/>
+      </w:rPr>
+    </w:lvl>
+    <w:lvl w:ilvl="7" w:tplc="04090003" w:tentative="1">
+      <w:start w:val="1"/>
+      <w:numFmt w:val="bullet"/>
+      <w:lvlText w:val="o"/>
+      <w:lvlJc w:val="left"/>
+      <w:pPr>
+        <w:ind w:left="5760" w:hanging="360"/>
+      </w:pPr>
+      <w:rPr>
+        <w:rFonts w:ascii="Courier New" w:hAnsi="Courier New" w:cs="Courier New" w:hint="default"/>
+      </w:rPr>
+    </w:lvl>
+    <w:lvl w:ilvl="8" w:tplc="04090005" w:tentative="1">
+      <w:start w:val="1"/>
+      <w:numFmt w:val="bullet"/>
+      <w:lvlText w:val=""/>
+      <w:lvlJc w:val="left"/>
+      <w:pPr>
+        <w:ind w:left="6480" w:hanging="360"/>
+      </w:pPr>
+      <w:rPr>
+        <w:rFonts w:ascii="Wingdings" w:hAnsi="Wingdings" w:hint="default"/>
+      </w:rPr>
+    </w:lvl>
+  </w:abstractNum>
+  <w:abstractNum w:abstractNumId="1" w15:restartNumberingAfterBreak="0">
+    <w:nsid w:val="333C3090"/>
+    <w:multiLevelType w:val="hybridMultilevel"/>
+    <w:tmpl w:val="690084A4"/>
+    <w:lvl w:ilvl="0" w:tplc="04090001">
+      <w:start w:val="1"/>
+      <w:numFmt w:val="bullet"/>
+      <w:lvlText w:val=""/>
+      <w:lvlJc w:val="left"/>
+      <w:pPr>
+        <w:ind w:left="360" w:hanging="360"/>
+      </w:pPr>
+      <w:rPr>
+        <w:rFonts w:ascii="Symbol" w:hAnsi="Symbol" w:hint="default"/>
+      </w:rPr>
+    </w:lvl>
+    <w:lvl w:ilvl="1" w:tplc="04090003" w:tentative="1">
+      <w:start w:val="1"/>
+      <w:numFmt w:val="bullet"/>
+      <w:lvlText w:val="o"/>
+      <w:lvlJc w:val="left"/>
+      <w:pPr>
+        <w:ind w:left="1080" w:hanging="360"/>
+      </w:pPr>
+      <w:rPr>
+        <w:rFonts w:ascii="Courier New" w:hAnsi="Courier New" w:cs="Courier New" w:hint="default"/>
+      </w:rPr>
+    </w:lvl>
+    <w:lvl w:ilvl="2" w:tplc="04090005" w:tentative="1">
+      <w:start w:val="1"/>
+      <w:numFmt w:val="bullet"/>
+      <w:lvlText w:val=""/>
+      <w:lvlJc w:val="left"/>
+      <w:pPr>
+        <w:ind w:left="1800" w:hanging="360"/>
+      </w:pPr>
+      <w:rPr>
+        <w:rFonts w:ascii="Wingdings" w:hAnsi="Wingdings" w:hint="default"/>
+      </w:rPr>
+    </w:lvl>
+    <w:lvl w:ilvl="3" w:tplc="04090001" w:tentative="1">
+      <w:start w:val="1"/>
+      <w:numFmt w:val="bullet"/>
+      <w:lvlText w:val=""/>
+      <w:lvlJc w:val="left"/>
+      <w:pPr>
+        <w:ind w:left="2520" w:hanging="360"/>
+      </w:pPr>
+      <w:rPr>
+        <w:rFonts w:ascii="Symbol" w:hAnsi="Symbol" w:hint="default"/>
+      </w:rPr>
+    </w:lvl>
+    <w:lvl w:ilvl="4" w:tplc="04090003" w:tentative="1">
+      <w:start w:val="1"/>
+      <w:numFmt w:val="bullet"/>
+      <w:lvlText w:val="o"/>
+      <w:lvlJc w:val="left"/>
+      <w:pPr>
+        <w:ind w:left="3240" w:hanging="360"/>
+      </w:pPr>
+      <w:rPr>
+        <w:rFonts w:ascii="Courier New" w:hAnsi="Courier New" w:cs="Courier New" w:hint="default"/>
+      </w:rPr>
+    </w:lvl>
+    <w:lvl w:ilvl="5" w:tplc="04090005" w:tentative="1">
+      <w:start w:val="1"/>
+      <w:numFmt w:val="bullet"/>
+      <w:lvlText w:val=""/>
+      <w:lvlJc w:val="left"/>
+      <w:pPr>
+        <w:ind w:left="3960" w:hanging="360"/>
+      </w:pPr>
+      <w:rPr>
+        <w:rFonts w:ascii="Wingdings" w:hAnsi="Wingdings" w:hint="default"/>
+      </w:rPr>
+    </w:lvl>
+    <w:lvl w:ilvl="6" w:tplc="04090001" w:tentative="1">
+      <w:start w:val="1"/>
+      <w:numFmt w:val="bullet"/>
+      <w:lvlText w:val=""/>
+      <w:lvlJc w:val="left"/>
+      <w:pPr>
+        <w:ind w:left="4680" w:hanging="360"/>
+      </w:pPr>
+      <w:rPr>
+        <w:rFonts w:ascii="Symbol" w:hAnsi="Symbol" w:hint="default"/>
+      </w:rPr>
+    </w:lvl>
+    <w:lvl w:ilvl="7" w:tplc="04090003" w:tentative="1">
+      <w:start w:val="1"/>
+      <w:numFmt w:val="bullet"/>
+      <w:lvlText w:val="o"/>
+      <w:lvlJc w:val="left"/>
+      <w:pPr>
+        <w:ind w:left="5400" w:hanging="360"/>
+      </w:pPr>
+      <w:rPr>
+        <w:rFonts w:ascii="Courier New" w:hAnsi="Courier New" w:cs="Courier New" w:hint="default"/>
+      </w:rPr>
+    </w:lvl>
+    <w:lvl w:ilvl="8" w:tplc="04090005" w:tentative="1">
+      <w:start w:val="1"/>
+      <w:numFmt w:val="bullet"/>
+      <w:lvlText w:val=""/>
+      <w:lvlJc w:val="left"/>
+      <w:pPr>
+        <w:ind w:left="6120" w:hanging="360"/>
+      </w:pPr>
+      <w:rPr>
+        <w:rFonts w:ascii="Wingdings" w:hAnsi="Wingdings" w:hint="default"/>
+      </w:rPr>
+    </w:lvl>
+  </w:abstractNum>
+  <w:abstractNum w:abstractNumId="2" w15:restartNumberingAfterBreak="0">
+    <w:nsid w:val="48191DAB"/>
+    <w:multiLevelType w:val="hybridMultilevel"/>
+    <w:tmpl w:val="AF225A38"/>
+    <w:lvl w:ilvl="0" w:tplc="04090001">
+      <w:start w:val="1"/>
+      <w:numFmt w:val="bullet"/>
+      <w:lvlText w:val=""/>
+      <w:lvlJc w:val="left"/>
+      <w:pPr>
+        <w:ind w:left="720" w:hanging="360"/>
+      </w:pPr>
+      <w:rPr>
+        <w:rFonts w:ascii="Symbol" w:hAnsi="Symbol" w:hint="default"/>
+      </w:rPr>
+    </w:lvl>
+    <w:lvl w:ilvl="1" w:tplc="04090003" w:tentative="1">
+      <w:start w:val="1"/>
+      <w:numFmt w:val="bullet"/>
+      <w:lvlText w:val="o"/>
+      <w:lvlJc w:val="left"/>
+      <w:pPr>
+        <w:ind w:left="1440" w:hanging="360"/>
+      </w:pPr>
+      <w:rPr>
+        <w:rFonts w:ascii="Courier New" w:hAnsi="Courier New" w:cs="Courier New" w:hint="default"/>
+      </w:rPr>
+    </w:lvl>
+    <w:lvl w:ilvl="2" w:tplc="04090005" w:tentative="1">
+      <w:start w:val="1"/>
+      <w:numFmt w:val="bullet"/>
+      <w:lvlText w:val=""/>
+      <w:lvlJc w:val="left"/>
+      <w:pPr>
+        <w:ind w:left="2160" w:hanging="360"/>
+      </w:pPr>
+      <w:rPr>
+        <w:rFonts w:ascii="Wingdings" w:hAnsi="Wingdings" w:hint="default"/>
+      </w:rPr>
+    </w:lvl>
+    <w:lvl w:ilvl="3" w:tplc="04090001" w:tentative="1">
+      <w:start w:val="1"/>
+      <w:numFmt w:val="bullet"/>
+      <w:lvlText w:val=""/>
+      <w:lvlJc w:val="left"/>
+      <w:pPr>
+        <w:ind w:left="2880" w:hanging="360"/>
+      </w:pPr>
+      <w:rPr>
+        <w:rFonts w:ascii="Symbol" w:hAnsi="Symbol" w:hint="default"/>
+      </w:rPr>
+    </w:lvl>
+    <w:lvl w:ilvl="4" w:tplc="04090003" w:tentative="1">
+      <w:start w:val="1"/>
+      <w:numFmt w:val="bullet"/>
+      <w:lvlText w:val="o"/>
+      <w:lvlJc w:val="left"/>
+      <w:pPr>
+        <w:ind w:left="3600" w:hanging="360"/>
+      </w:pPr>
+      <w:rPr>
+        <w:rFonts w:ascii="Courier New" w:hAnsi="Courier New" w:cs="Courier New" w:hint="default"/>
+      </w:rPr>
+    </w:lvl>
+    <w:lvl w:ilvl="5" w:tplc="04090005" w:tentative="1">
+      <w:start w:val="1"/>
+      <w:numFmt w:val="bullet"/>
+      <w:lvlText w:val=""/>
+      <w:lvlJc w:val="left"/>
+      <w:pPr>
+        <w:ind w:left="4320" w:hanging="360"/>
+      </w:pPr>
+      <w:rPr>
+        <w:rFonts w:ascii="Wingdings" w:hAnsi="Wingdings" w:hint="default"/>
+      </w:rPr>
+    </w:lvl>
+    <w:lvl w:ilvl="6" w:tplc="04090001" w:tentative="1">
+      <w:start w:val="1"/>
+      <w:numFmt w:val="bullet"/>
+      <w:lvlText w:val=""/>
+      <w:lvlJc w:val="left"/>
+      <w:pPr>
+        <w:ind w:left="5040" w:hanging="360"/>
+      </w:pPr>
+      <w:rPr>
+        <w:rFonts w:ascii="Symbol" w:hAnsi="Symbol" w:hint="default"/>
+      </w:rPr>
+    </w:lvl>
+    <w:lvl w:ilvl="7" w:tplc="04090003" w:tentative="1">
+      <w:start w:val="1"/>
+      <w:numFmt w:val="bullet"/>
+      <w:lvlText w:val="o"/>
+      <w:lvlJc w:val="left"/>
+      <w:pPr>
+        <w:ind w:left="5760" w:hanging="360"/>
+      </w:pPr>
+      <w:rPr>
+        <w:rFonts w:ascii="Courier New" w:hAnsi="Courier New" w:cs="Courier New" w:hint="default"/>
+      </w:rPr>
+    </w:lvl>
+    <w:lvl w:ilvl="8" w:tplc="04090005" w:tentative="1">
+      <w:start w:val="1"/>
+      <w:numFmt w:val="bullet"/>
+      <w:lvlText w:val=""/>
+      <w:lvlJc w:val="left"/>
+      <w:pPr>
+        <w:ind w:left="6480" w:hanging="360"/>
+      </w:pPr>
+      <w:rPr>
+        <w:rFonts w:ascii="Wingdings" w:hAnsi="Wingdings" w:hint="default"/>
+      </w:rPr>
+    </w:lvl>
+  </w:abstractNum>
+  <w:abstractNum w:abstractNumId="3" w15:restartNumberingAfterBreak="0">
     <w:nsid w:val="4BC335D7"/>
     <w:multiLevelType w:val="multilevel"/>
     <w:tmpl w:val="689C936C"/>
@@ -2832,7 +4021,7 @@
       </w:pPr>
     </w:lvl>
   </w:abstractNum>
-  <w:abstractNum w:abstractNumId="1" w15:restartNumberingAfterBreak="0">
+  <w:abstractNum w:abstractNumId="4" w15:restartNumberingAfterBreak="0">
     <w:nsid w:val="525726A9"/>
     <w:multiLevelType w:val="hybridMultilevel"/>
     <w:tmpl w:val="01D2402A"/>
@@ -2925,10 +4114,10 @@
       </w:pPr>
     </w:lvl>
   </w:abstractNum>
-  <w:abstractNum w:abstractNumId="2" w15:restartNumberingAfterBreak="0">
+  <w:abstractNum w:abstractNumId="5" w15:restartNumberingAfterBreak="0">
     <w:nsid w:val="58502B1D"/>
     <w:multiLevelType w:val="multilevel"/>
-    <w:tmpl w:val="1BEC725A"/>
+    <w:tmpl w:val="D93A3E4A"/>
     <w:lvl w:ilvl="0">
       <w:start w:val="1"/>
       <w:numFmt w:val="decimal"/>
@@ -3055,7 +4244,7 @@
       </w:rPr>
     </w:lvl>
   </w:abstractNum>
-  <w:abstractNum w:abstractNumId="3" w15:restartNumberingAfterBreak="0">
+  <w:abstractNum w:abstractNumId="6" w15:restartNumberingAfterBreak="0">
     <w:nsid w:val="689C666C"/>
     <w:multiLevelType w:val="multilevel"/>
     <w:tmpl w:val="EE2EDA7E"/>
@@ -3169,7 +4358,93 @@
       </w:pPr>
     </w:lvl>
   </w:abstractNum>
-  <w:abstractNum w:abstractNumId="4" w15:restartNumberingAfterBreak="0">
+  <w:abstractNum w:abstractNumId="7" w15:restartNumberingAfterBreak="0">
+    <w:nsid w:val="797666BE"/>
+    <w:multiLevelType w:val="hybridMultilevel"/>
+    <w:tmpl w:val="66DC98DA"/>
+    <w:lvl w:ilvl="0" w:tplc="0409001B">
+      <w:start w:val="1"/>
+      <w:numFmt w:val="lowerRoman"/>
+      <w:lvlText w:val="%1."/>
+      <w:lvlJc w:val="right"/>
+      <w:pPr>
+        <w:ind w:left="720" w:hanging="360"/>
+      </w:pPr>
+    </w:lvl>
+    <w:lvl w:ilvl="1" w:tplc="04090019" w:tentative="1">
+      <w:start w:val="1"/>
+      <w:numFmt w:val="lowerLetter"/>
+      <w:lvlText w:val="%2."/>
+      <w:lvlJc w:val="left"/>
+      <w:pPr>
+        <w:ind w:left="1440" w:hanging="360"/>
+      </w:pPr>
+    </w:lvl>
+    <w:lvl w:ilvl="2" w:tplc="0409001B" w:tentative="1">
+      <w:start w:val="1"/>
+      <w:numFmt w:val="lowerRoman"/>
+      <w:lvlText w:val="%3."/>
+      <w:lvlJc w:val="right"/>
+      <w:pPr>
+        <w:ind w:left="2160" w:hanging="180"/>
+      </w:pPr>
+    </w:lvl>
+    <w:lvl w:ilvl="3" w:tplc="0409000F" w:tentative="1">
+      <w:start w:val="1"/>
+      <w:numFmt w:val="decimal"/>
+      <w:lvlText w:val="%4."/>
+      <w:lvlJc w:val="left"/>
+      <w:pPr>
+        <w:ind w:left="2880" w:hanging="360"/>
+      </w:pPr>
+    </w:lvl>
+    <w:lvl w:ilvl="4" w:tplc="04090019" w:tentative="1">
+      <w:start w:val="1"/>
+      <w:numFmt w:val="lowerLetter"/>
+      <w:lvlText w:val="%5."/>
+      <w:lvlJc w:val="left"/>
+      <w:pPr>
+        <w:ind w:left="3600" w:hanging="360"/>
+      </w:pPr>
+    </w:lvl>
+    <w:lvl w:ilvl="5" w:tplc="0409001B" w:tentative="1">
+      <w:start w:val="1"/>
+      <w:numFmt w:val="lowerRoman"/>
+      <w:lvlText w:val="%6."/>
+      <w:lvlJc w:val="right"/>
+      <w:pPr>
+        <w:ind w:left="4320" w:hanging="180"/>
+      </w:pPr>
+    </w:lvl>
+    <w:lvl w:ilvl="6" w:tplc="0409000F" w:tentative="1">
+      <w:start w:val="1"/>
+      <w:numFmt w:val="decimal"/>
+      <w:lvlText w:val="%7."/>
+      <w:lvlJc w:val="left"/>
+      <w:pPr>
+        <w:ind w:left="5040" w:hanging="360"/>
+      </w:pPr>
+    </w:lvl>
+    <w:lvl w:ilvl="7" w:tplc="04090019" w:tentative="1">
+      <w:start w:val="1"/>
+      <w:numFmt w:val="lowerLetter"/>
+      <w:lvlText w:val="%8."/>
+      <w:lvlJc w:val="left"/>
+      <w:pPr>
+        <w:ind w:left="5760" w:hanging="360"/>
+      </w:pPr>
+    </w:lvl>
+    <w:lvl w:ilvl="8" w:tplc="0409001B" w:tentative="1">
+      <w:start w:val="1"/>
+      <w:numFmt w:val="lowerRoman"/>
+      <w:lvlText w:val="%9."/>
+      <w:lvlJc w:val="right"/>
+      <w:pPr>
+        <w:ind w:left="6480" w:hanging="180"/>
+      </w:pPr>
+    </w:lvl>
+  </w:abstractNum>
+  <w:abstractNum w:abstractNumId="8" w15:restartNumberingAfterBreak="0">
     <w:nsid w:val="7A1B41C8"/>
     <w:multiLevelType w:val="hybridMultilevel"/>
     <w:tmpl w:val="4320A172"/>
@@ -3259,25 +4534,37 @@
     </w:lvl>
   </w:abstractNum>
   <w:num w:numId="1" w16cid:durableId="1153060903">
+    <w:abstractNumId w:val="5"/>
+  </w:num>
+  <w:num w:numId="2" w16cid:durableId="1660188722">
+    <w:abstractNumId w:val="5"/>
+  </w:num>
+  <w:num w:numId="3" w16cid:durableId="282200120">
+    <w:abstractNumId w:val="3"/>
+  </w:num>
+  <w:num w:numId="4" w16cid:durableId="800465909">
+    <w:abstractNumId w:val="5"/>
+  </w:num>
+  <w:num w:numId="5" w16cid:durableId="1347711845">
+    <w:abstractNumId w:val="6"/>
+  </w:num>
+  <w:num w:numId="6" w16cid:durableId="206335731">
+    <w:abstractNumId w:val="8"/>
+  </w:num>
+  <w:num w:numId="7" w16cid:durableId="1466585050">
+    <w:abstractNumId w:val="4"/>
+  </w:num>
+  <w:num w:numId="8" w16cid:durableId="1043946362">
+    <w:abstractNumId w:val="1"/>
+  </w:num>
+  <w:num w:numId="9" w16cid:durableId="1395351159">
     <w:abstractNumId w:val="2"/>
   </w:num>
-  <w:num w:numId="2" w16cid:durableId="1660188722">
-    <w:abstractNumId w:val="2"/>
-  </w:num>
-  <w:num w:numId="3" w16cid:durableId="282200120">
+  <w:num w:numId="10" w16cid:durableId="1412192339">
     <w:abstractNumId w:val="0"/>
   </w:num>
-  <w:num w:numId="4" w16cid:durableId="800465909">
-    <w:abstractNumId w:val="2"/>
-  </w:num>
-  <w:num w:numId="5" w16cid:durableId="1347711845">
-    <w:abstractNumId w:val="3"/>
-  </w:num>
-  <w:num w:numId="6" w16cid:durableId="206335731">
-    <w:abstractNumId w:val="4"/>
-  </w:num>
-  <w:num w:numId="7" w16cid:durableId="1466585050">
-    <w:abstractNumId w:val="1"/>
+  <w:num w:numId="11" w16cid:durableId="2003924118">
+    <w:abstractNumId w:val="7"/>
   </w:num>
 </w:numbering>
 </file>
@@ -3682,7 +4969,7 @@
   <w:style w:type="paragraph" w:default="1" w:styleId="Normal">
     <w:name w:val="Normal"/>
     <w:qFormat/>
-    <w:rsid w:val="00927942"/>
+    <w:rsid w:val="00B140B3"/>
   </w:style>
   <w:style w:type="paragraph" w:styleId="Heading1">
     <w:name w:val="heading 1"/>
@@ -3916,31 +5203,31 @@
     <w:link w:val="Main-HeadingChar"/>
     <w:autoRedefine/>
     <w:qFormat/>
-    <w:rsid w:val="000F7A50"/>
+    <w:rsid w:val="00E00062"/>
     <w:pPr>
       <w:numPr>
         <w:numId w:val="5"/>
       </w:numPr>
       <w:spacing w:line="360" w:lineRule="auto"/>
       <w:ind w:left="360" w:hanging="360"/>
-      <w:jc w:val="center"/>
     </w:pPr>
     <w:rPr>
       <w:rFonts w:ascii="Times New Roman" w:hAnsi="Times New Roman"/>
       <w:b/>
       <w:color w:val="000000" w:themeColor="text1"/>
+      <w:sz w:val="28"/>
     </w:rPr>
   </w:style>
   <w:style w:type="character" w:customStyle="1" w:styleId="Main-HeadingChar">
     <w:name w:val="Main-Heading Char"/>
     <w:basedOn w:val="Heading1Char"/>
     <w:link w:val="Main-Heading"/>
-    <w:rsid w:val="000F7A50"/>
+    <w:rsid w:val="00E00062"/>
     <w:rPr>
       <w:rFonts w:ascii="Times New Roman" w:eastAsiaTheme="majorEastAsia" w:hAnsi="Times New Roman" w:cstheme="majorBidi"/>
       <w:b/>
       <w:color w:val="000000" w:themeColor="text1"/>
-      <w:sz w:val="40"/>
+      <w:sz w:val="28"/>
       <w:szCs w:val="40"/>
     </w:rPr>
   </w:style>
@@ -3963,28 +5250,32 @@
     <w:link w:val="sub-heading2Char"/>
     <w:autoRedefine/>
     <w:qFormat/>
-    <w:rsid w:val="00CC5AD3"/>
+    <w:rsid w:val="00BB6A7F"/>
     <w:pPr>
       <w:numPr>
         <w:ilvl w:val="1"/>
         <w:numId w:val="4"/>
       </w:numPr>
-      <w:spacing w:line="278" w:lineRule="auto"/>
+      <w:spacing w:before="240" w:line="360" w:lineRule="auto"/>
+      <w:ind w:left="432"/>
     </w:pPr>
     <w:rPr>
       <w:rFonts w:ascii="Times New Roman" w:hAnsi="Times New Roman"/>
+      <w:b/>
       <w:color w:val="000000" w:themeColor="text1"/>
+      <w:sz w:val="24"/>
     </w:rPr>
   </w:style>
   <w:style w:type="character" w:customStyle="1" w:styleId="sub-heading2Char">
     <w:name w:val="sub-heading2 Char"/>
     <w:basedOn w:val="Heading2Char"/>
     <w:link w:val="sub-heading2"/>
-    <w:rsid w:val="00CC5AD3"/>
+    <w:rsid w:val="00BB6A7F"/>
     <w:rPr>
       <w:rFonts w:ascii="Times New Roman" w:eastAsiaTheme="majorEastAsia" w:hAnsi="Times New Roman" w:cstheme="majorBidi"/>
+      <w:b/>
       <w:color w:val="000000" w:themeColor="text1"/>
-      <w:sz w:val="32"/>
+      <w:sz w:val="24"/>
       <w:szCs w:val="32"/>
     </w:rPr>
   </w:style>
@@ -4008,7 +5299,7 @@
     <w:link w:val="sub-heading3Char"/>
     <w:autoRedefine/>
     <w:qFormat/>
-    <w:rsid w:val="00CC5AD3"/>
+    <w:rsid w:val="00D82AED"/>
     <w:pPr>
       <w:numPr>
         <w:ilvl w:val="2"/>
@@ -4018,21 +5309,25 @@
         <w:tab w:val="num" w:pos="1440"/>
       </w:tabs>
       <w:spacing w:line="278" w:lineRule="auto"/>
+      <w:ind w:left="504"/>
     </w:pPr>
     <w:rPr>
       <w:rFonts w:ascii="Times New Roman" w:hAnsi="Times New Roman"/>
+      <w:b/>
       <w:color w:val="000000" w:themeColor="text1"/>
+      <w:sz w:val="24"/>
     </w:rPr>
   </w:style>
   <w:style w:type="character" w:customStyle="1" w:styleId="sub-heading3Char">
     <w:name w:val="sub-heading3 Char"/>
     <w:basedOn w:val="Heading3Char"/>
     <w:link w:val="sub-heading3"/>
-    <w:rsid w:val="00CC5AD3"/>
+    <w:rsid w:val="00D82AED"/>
     <w:rPr>
       <w:rFonts w:ascii="Times New Roman" w:eastAsiaTheme="majorEastAsia" w:hAnsi="Times New Roman" w:cstheme="majorBidi"/>
+      <w:b/>
       <w:color w:val="000000" w:themeColor="text1"/>
-      <w:sz w:val="28"/>
+      <w:sz w:val="24"/>
       <w:szCs w:val="28"/>
     </w:rPr>
   </w:style>
@@ -4317,6 +5612,113 @@
         <w:insideV w:val="single" w:sz="4" w:space="0" w:color="auto"/>
       </w:tblBorders>
     </w:tblPr>
+  </w:style>
+  <w:style w:type="character" w:styleId="Strong">
+    <w:name w:val="Strong"/>
+    <w:basedOn w:val="DefaultParagraphFont"/>
+    <w:uiPriority w:val="22"/>
+    <w:qFormat/>
+    <w:rsid w:val="00D66C91"/>
+    <w:rPr>
+      <w:b/>
+      <w:bCs/>
+    </w:rPr>
+  </w:style>
+  <w:style w:type="character" w:styleId="CommentReference">
+    <w:name w:val="annotation reference"/>
+    <w:basedOn w:val="DefaultParagraphFont"/>
+    <w:uiPriority w:val="99"/>
+    <w:semiHidden/>
+    <w:unhideWhenUsed/>
+    <w:rsid w:val="00D66C91"/>
+    <w:rPr>
+      <w:sz w:val="16"/>
+      <w:szCs w:val="16"/>
+    </w:rPr>
+  </w:style>
+  <w:style w:type="paragraph" w:styleId="CommentText">
+    <w:name w:val="annotation text"/>
+    <w:basedOn w:val="Normal"/>
+    <w:link w:val="CommentTextChar"/>
+    <w:uiPriority w:val="99"/>
+    <w:semiHidden/>
+    <w:unhideWhenUsed/>
+    <w:rsid w:val="00D66C91"/>
+    <w:pPr>
+      <w:spacing w:line="240" w:lineRule="auto"/>
+    </w:pPr>
+    <w:rPr>
+      <w:sz w:val="20"/>
+      <w:szCs w:val="20"/>
+    </w:rPr>
+  </w:style>
+  <w:style w:type="character" w:customStyle="1" w:styleId="CommentTextChar">
+    <w:name w:val="Comment Text Char"/>
+    <w:basedOn w:val="DefaultParagraphFont"/>
+    <w:link w:val="CommentText"/>
+    <w:uiPriority w:val="99"/>
+    <w:semiHidden/>
+    <w:rsid w:val="00D66C91"/>
+    <w:rPr>
+      <w:sz w:val="20"/>
+      <w:szCs w:val="20"/>
+    </w:rPr>
+  </w:style>
+  <w:style w:type="paragraph" w:styleId="CommentSubject">
+    <w:name w:val="annotation subject"/>
+    <w:basedOn w:val="CommentText"/>
+    <w:next w:val="CommentText"/>
+    <w:link w:val="CommentSubjectChar"/>
+    <w:uiPriority w:val="99"/>
+    <w:semiHidden/>
+    <w:unhideWhenUsed/>
+    <w:rsid w:val="00D66C91"/>
+    <w:rPr>
+      <w:b/>
+      <w:bCs/>
+    </w:rPr>
+  </w:style>
+  <w:style w:type="character" w:customStyle="1" w:styleId="CommentSubjectChar">
+    <w:name w:val="Comment Subject Char"/>
+    <w:basedOn w:val="CommentTextChar"/>
+    <w:link w:val="CommentSubject"/>
+    <w:uiPriority w:val="99"/>
+    <w:semiHidden/>
+    <w:rsid w:val="00D66C91"/>
+    <w:rPr>
+      <w:b/>
+      <w:bCs/>
+      <w:sz w:val="20"/>
+      <w:szCs w:val="20"/>
+    </w:rPr>
+  </w:style>
+  <w:style w:type="paragraph" w:styleId="Revision">
+    <w:name w:val="Revision"/>
+    <w:hidden/>
+    <w:uiPriority w:val="99"/>
+    <w:semiHidden/>
+    <w:rsid w:val="00D66C91"/>
+    <w:pPr>
+      <w:spacing w:after="0" w:line="240" w:lineRule="auto"/>
+    </w:pPr>
+  </w:style>
+  <w:style w:type="paragraph" w:styleId="Bibliography">
+    <w:name w:val="Bibliography"/>
+    <w:basedOn w:val="Normal"/>
+    <w:next w:val="Normal"/>
+    <w:uiPriority w:val="37"/>
+    <w:unhideWhenUsed/>
+    <w:rsid w:val="00D66C91"/>
+  </w:style>
+  <w:style w:type="paragraph" w:styleId="Normal0">
+    <w:name w:val="Normal"/>
+    <w:next w:val="Normal"/>
+    <w:qFormat/>
+    <w:rsid w:val="00B140B3"/>
+    <w:rPr>
+      <w:rFonts w:ascii="Times New Roman" w:hAnsi="Times New Roman"/>
+      <w:sz w:val="24"/>
+    </w:rPr>
   </w:style>
 </w:styles>
 </file>
@@ -4614,4 +6016,31 @@
     </a:ext>
   </a:extLst>
 </a:theme>
+</file>
+
+<file path=customXml/item1.xml><?xml version="1.0" encoding="utf-8"?>
+<b:Sources xmlns:b="http://schemas.openxmlformats.org/officeDocument/2006/bibliography" xmlns="http://schemas.openxmlformats.org/officeDocument/2006/bibliography" SelectedStyle="\APASixthEditionOfficeOnline.xsl" StyleName="APA" Version="6">
+  <b:Source>
+    <b:Tag>Cha26</b:Tag>
+    <b:SourceType>JournalArticle</b:SourceType>
+    <b:Guid>{B3725006-5759-4649-A913-6F07A4E45E8B}</b:Guid>
+    <b:Author>
+      <b:Author>
+        <b:Corporate>Chang Wei Jie</b:Corporate>
+      </b:Author>
+    </b:Author>
+    <b:Title>Waste Management in Malaysia: The Complete Enterprise Guide (2026)</b:Title>
+    <b:JournalName>gargeon.com</b:JournalName>
+    <b:Year>April 23, 2026</b:Year>
+    <b:RefOrder>1</b:RefOrder>
+  </b:Source>
+</b:Sources>
+</file>
+
+<file path=customXml/itemProps1.xml><?xml version="1.0" encoding="utf-8"?>
+<ds:datastoreItem xmlns:ds="http://schemas.openxmlformats.org/officeDocument/2006/customXml" ds:itemID="{A072E8C7-2F89-445B-81E4-868AAE225D0A}">
+  <ds:schemaRefs>
+    <ds:schemaRef ds:uri="http://schemas.openxmlformats.org/officeDocument/2006/bibliography"/>
+  </ds:schemaRefs>
+</ds:datastoreItem>
 </file>
</xml_diff>